<commit_message>
feat: add DashboardView component with todo management and statistics visualization
</commit_message>
<xml_diff>
--- a/docs/släktträd.docx
+++ b/docs/släktträd.docx
@@ -40,8 +40,44 @@
         <w:rPr>
           <w:lang w:val="en-US"/>
         </w:rPr>
-        <w:t>React/Electron → (HTTP-anrop, t.ex. fetch) → Flask (Python) → (SQL) → SQLite-databas</w:t>
-      </w:r>
+        <w:t>React/Electron → (HTTP-</w:t>
+      </w:r>
+      <w:proofErr w:type="spellStart"/>
+      <w:r>
+        <w:rPr>
+          <w:lang w:val="en-US"/>
+        </w:rPr>
+        <w:t>anrop</w:t>
+      </w:r>
+      <w:proofErr w:type="spellEnd"/>
+      <w:r>
+        <w:rPr>
+          <w:lang w:val="en-US"/>
+        </w:rPr>
+        <w:t xml:space="preserve">, </w:t>
+      </w:r>
+      <w:proofErr w:type="spellStart"/>
+      <w:r>
+        <w:rPr>
+          <w:lang w:val="en-US"/>
+        </w:rPr>
+        <w:t>t.ex</w:t>
+      </w:r>
+      <w:proofErr w:type="spellEnd"/>
+      <w:r>
+        <w:rPr>
+          <w:lang w:val="en-US"/>
+        </w:rPr>
+        <w:t>. fetch) → Flask (Python) → (SQL) → SQLite-</w:t>
+      </w:r>
+      <w:proofErr w:type="spellStart"/>
+      <w:r>
+        <w:rPr>
+          <w:lang w:val="en-US"/>
+        </w:rPr>
+        <w:t>databas</w:t>
+      </w:r>
+      <w:proofErr w:type="spellEnd"/>
     </w:p>
     <w:p>
       <w:pPr>
@@ -67,19 +103,33 @@
         <w:rPr>
           <w:lang w:val="en-US"/>
         </w:rPr>
-        <w:t>C:\Users\denni\Documents\Dennis\programmering\WestFamilyTree\WestFamilyTree&gt; npm run dev</w:t>
-      </w:r>
-    </w:p>
-    <w:p>
-      <w:pPr>
+        <w:t xml:space="preserve">C:\Users\denni\Documents\Dennis\programmering\WestFamilyTree\WestFamilyTree&gt; </w:t>
+      </w:r>
+      <w:proofErr w:type="spellStart"/>
+      <w:r>
         <w:rPr>
           <w:lang w:val="en-US"/>
         </w:rPr>
-      </w:pPr>
+        <w:t>npm</w:t>
+      </w:r>
+      <w:proofErr w:type="spellEnd"/>
       <w:r>
         <w:rPr>
           <w:lang w:val="en-US"/>
         </w:rPr>
+        <w:t xml:space="preserve"> run dev</w:t>
+      </w:r>
+    </w:p>
+    <w:p>
+      <w:pPr>
+        <w:rPr>
+          <w:lang w:val="en-US"/>
+        </w:rPr>
+      </w:pPr>
+      <w:r>
+        <w:rPr>
+          <w:lang w:val="en-US"/>
+        </w:rPr>
         <w:t xml:space="preserve">C:\Users\denni\Documents\Dennis\programmering\WestFamilyTree\WestFamilyTree&gt; </w:t>
       </w:r>
       <w:r>
@@ -120,11 +170,19 @@
         </w:rPr>
         <w:t xml:space="preserve">C:\Users\denni\Documents\Dennis\programmering\WestFamilyTree\WestFamilyTree&gt; </w:t>
       </w:r>
+      <w:proofErr w:type="spellStart"/>
       <w:r>
         <w:rPr>
           <w:lang w:val="en-US"/>
         </w:rPr>
-        <w:t>npm run electron</w:t>
+        <w:t>npm</w:t>
+      </w:r>
+      <w:proofErr w:type="spellEnd"/>
+      <w:r>
+        <w:rPr>
+          <w:lang w:val="en-US"/>
+        </w:rPr>
+        <w:t xml:space="preserve"> run electron</w:t>
       </w:r>
     </w:p>
     <w:p>
@@ -359,8 +417,14 @@
           <w:ilvl w:val="0"/>
           <w:numId w:val="11"/>
         </w:numPr>
-      </w:pPr>
-      <w:r>
+        <w:rPr>
+          <w:strike/>
+        </w:rPr>
+      </w:pPr>
+      <w:r>
+        <w:rPr>
+          <w:strike/>
+        </w:rPr>
         <w:t>"På denna dag" (On This Day):</w:t>
       </w:r>
     </w:p>
@@ -371,8 +435,14 @@
           <w:ilvl w:val="1"/>
           <w:numId w:val="11"/>
         </w:numPr>
-      </w:pPr>
-      <w:r>
+        <w:rPr>
+          <w:strike/>
+        </w:rPr>
+      </w:pPr>
+      <w:r>
+        <w:rPr>
+          <w:strike/>
+        </w:rPr>
         <w:t>En widget på startsidan: "Idag är det 14 november. Här är 3 bilder som togs detta datum genom historien."</w:t>
       </w:r>
     </w:p>
@@ -383,13 +453,20 @@
           <w:ilvl w:val="0"/>
           <w:numId w:val="11"/>
         </w:numPr>
-      </w:pPr>
-      <w:r>
+        <w:rPr>
+          <w:strike/>
+        </w:rPr>
+      </w:pPr>
+      <w:r>
+        <w:rPr>
+          <w:strike/>
+        </w:rPr>
         <w:t xml:space="preserve">Namnstatistik och Dashboards </w:t>
       </w:r>
       <w:r>
         <w:rPr>
           <w:rFonts w:ascii="Segoe UI Emoji" w:hAnsi="Segoe UI Emoji" w:cs="Segoe UI Emoji"/>
+          <w:strike/>
         </w:rPr>
         <w:t>📊</w:t>
       </w:r>
@@ -401,8 +478,14 @@
           <w:ilvl w:val="1"/>
           <w:numId w:val="11"/>
         </w:numPr>
-      </w:pPr>
-      <w:r>
+        <w:rPr>
+          <w:strike/>
+        </w:rPr>
+      </w:pPr>
+      <w:r>
+        <w:rPr>
+          <w:strike/>
+        </w:rPr>
         <w:t>Idé: En "Statistik"-flik som visar grafer.</w:t>
       </w:r>
     </w:p>
@@ -413,8 +496,14 @@
           <w:ilvl w:val="1"/>
           <w:numId w:val="11"/>
         </w:numPr>
-      </w:pPr>
-      <w:r>
+        <w:rPr>
+          <w:strike/>
+        </w:rPr>
+      </w:pPr>
+      <w:r>
+        <w:rPr>
+          <w:strike/>
+        </w:rPr>
         <w:t>Data:</w:t>
       </w:r>
     </w:p>
@@ -425,8 +514,14 @@
           <w:ilvl w:val="2"/>
           <w:numId w:val="11"/>
         </w:numPr>
-      </w:pPr>
-      <w:r>
+        <w:rPr>
+          <w:strike/>
+        </w:rPr>
+      </w:pPr>
+      <w:r>
+        <w:rPr>
+          <w:strike/>
+        </w:rPr>
         <w:t>"Vanligaste förnamnet i släkten."</w:t>
       </w:r>
     </w:p>
@@ -437,8 +532,14 @@
           <w:ilvl w:val="2"/>
           <w:numId w:val="11"/>
         </w:numPr>
-      </w:pPr>
-      <w:r>
+        <w:rPr>
+          <w:strike/>
+        </w:rPr>
+      </w:pPr>
+      <w:r>
+        <w:rPr>
+          <w:strike/>
+        </w:rPr>
         <w:t>"Medellivslängd per århundrade."</w:t>
       </w:r>
     </w:p>
@@ -449,8 +550,14 @@
           <w:ilvl w:val="2"/>
           <w:numId w:val="11"/>
         </w:numPr>
-      </w:pPr>
-      <w:r>
+        <w:rPr>
+          <w:strike/>
+        </w:rPr>
+      </w:pPr>
+      <w:r>
+        <w:rPr>
+          <w:strike/>
+        </w:rPr>
         <w:t>"Vilken månad föddes flest barn?"</w:t>
       </w:r>
     </w:p>
@@ -461,8 +568,14 @@
           <w:ilvl w:val="2"/>
           <w:numId w:val="11"/>
         </w:numPr>
-      </w:pPr>
-      <w:r>
+        <w:rPr>
+          <w:strike/>
+        </w:rPr>
+      </w:pPr>
+      <w:r>
+        <w:rPr>
+          <w:strike/>
+        </w:rPr>
         <w:t>"Karta över var släkten bott (Heatmap)."</w:t>
       </w:r>
     </w:p>
@@ -473,8 +586,14 @@
           <w:ilvl w:val="0"/>
           <w:numId w:val="11"/>
         </w:numPr>
-      </w:pPr>
-      <w:r>
+        <w:rPr>
+          <w:strike/>
+        </w:rPr>
+      </w:pPr>
+      <w:r>
+        <w:rPr>
+          <w:strike/>
+        </w:rPr>
         <w:t>Att-göra-listor (Todo): Koppla uppgifter till personer. "Kolla upp bouppteckningen för Karl".</w:t>
       </w:r>
     </w:p>
@@ -482,8 +601,14 @@
       <w:pPr>
         <w:pStyle w:val="ListParagraph"/>
         <w:ind w:left="360"/>
-      </w:pPr>
-      <w:r>
+        <w:rPr>
+          <w:strike/>
+        </w:rPr>
+      </w:pPr>
+      <w:r>
+        <w:rPr>
+          <w:strike/>
+        </w:rPr>
         <w:t>Fortsätt där man slutade….</w:t>
       </w:r>
     </w:p>
@@ -682,7 +807,69 @@
         </w:numPr>
       </w:pPr>
       <w:r>
-        <w:t>Avancerad sök (Samam somo i sök flik)</w:t>
+        <w:t xml:space="preserve">Relationskalkylator ("Hur är vi släkt?") </w:t>
+      </w:r>
+      <w:r>
+        <w:rPr>
+          <w:rFonts w:ascii="Segoe UI Emoji" w:hAnsi="Segoe UI Emoji" w:cs="Segoe UI Emoji"/>
+        </w:rPr>
+        <w:t>🧮</w:t>
+      </w:r>
+    </w:p>
+    <w:p>
+      <w:pPr>
+        <w:pStyle w:val="ListParagraph"/>
+        <w:numPr>
+          <w:ilvl w:val="1"/>
+          <w:numId w:val="10"/>
+        </w:numPr>
+      </w:pPr>
+      <w:r>
+        <w:t>Idé: Du väljer Person A (dig själv) och Person B (en avlägsen släkting).</w:t>
+      </w:r>
+    </w:p>
+    <w:p>
+      <w:pPr>
+        <w:pStyle w:val="ListParagraph"/>
+        <w:numPr>
+          <w:ilvl w:val="1"/>
+          <w:numId w:val="10"/>
+        </w:numPr>
+      </w:pPr>
+      <w:r>
+        <w:t>Resultat: Appen räknar ut den kortaste vägen och säger: "Ni är bryllingar (fyrmänningar). Er gemensamma ana är Per Persson född 1750."</w:t>
+      </w:r>
+    </w:p>
+    <w:p>
+      <w:pPr>
+        <w:pStyle w:val="ListParagraph"/>
+        <w:numPr>
+          <w:ilvl w:val="1"/>
+          <w:numId w:val="10"/>
+        </w:numPr>
+      </w:pPr>
+      <w:r>
+        <w:t>Gren</w:t>
+      </w:r>
+    </w:p>
+    <w:p>
+      <w:pPr>
+        <w:pStyle w:val="ListParagraph"/>
+        <w:numPr>
+          <w:ilvl w:val="1"/>
+          <w:numId w:val="10"/>
+        </w:numPr>
+      </w:pPr>
+      <w:r>
+        <w:t>färglägg</w:t>
+      </w:r>
+    </w:p>
+    <w:p>
+      <w:pPr>
+        <w:pStyle w:val="Heading2"/>
+      </w:pPr>
+      <w:r>
+        <w:t>Redigera person:</w:t>
       </w:r>
     </w:p>
     <w:p>
@@ -694,7 +881,7 @@
         </w:numPr>
       </w:pPr>
       <w:r>
-        <w:t>Exportera bilder</w:t>
+        <w:t>Bokmärke</w:t>
       </w:r>
     </w:p>
     <w:p>
@@ -718,49 +905,7 @@
         </w:numPr>
       </w:pPr>
       <w:r>
-        <w:t xml:space="preserve">Relationskalkylator ("Hur är vi släkt?") </w:t>
-      </w:r>
-      <w:r>
-        <w:rPr>
-          <w:rFonts w:ascii="Segoe UI Emoji" w:hAnsi="Segoe UI Emoji" w:cs="Segoe UI Emoji"/>
-        </w:rPr>
-        <w:t>🧮</w:t>
-      </w:r>
-    </w:p>
-    <w:p>
-      <w:pPr>
-        <w:pStyle w:val="ListParagraph"/>
-        <w:numPr>
-          <w:ilvl w:val="1"/>
-          <w:numId w:val="10"/>
-        </w:numPr>
-      </w:pPr>
-      <w:r>
-        <w:t>Idé: Du väljer Person A (dig själv) och Person B (en avlägsen släkting).</w:t>
-      </w:r>
-    </w:p>
-    <w:p>
-      <w:pPr>
-        <w:pStyle w:val="ListParagraph"/>
-        <w:numPr>
-          <w:ilvl w:val="1"/>
-          <w:numId w:val="10"/>
-        </w:numPr>
-      </w:pPr>
-      <w:r>
-        <w:t>Resultat: Appen räknar ut den kortaste vägen och säger: "Ni är bryllingar (fyrmänningar). Er gemensamma ana är Per Persson född 1750."</w:t>
-      </w:r>
-    </w:p>
-    <w:p>
-      <w:pPr>
-        <w:pStyle w:val="ListParagraph"/>
-        <w:numPr>
-          <w:ilvl w:val="1"/>
-          <w:numId w:val="10"/>
-        </w:numPr>
-      </w:pPr>
-      <w:r>
-        <w:t>Teknik: Graf-algoritmer (Dijkstra eller Breadth-First Search) i JavaScript.</w:t>
+        <w:t>Exportera bilder</w:t>
       </w:r>
     </w:p>
     <w:p>
@@ -789,6 +934,63 @@
     </w:p>
     <w:p>
       <w:pPr>
+        <w:pStyle w:val="ListParagraph"/>
+        <w:numPr>
+          <w:ilvl w:val="0"/>
+          <w:numId w:val="10"/>
+        </w:numPr>
+      </w:pPr>
+      <w:r>
+        <w:t>Född som (namn)</w:t>
+      </w:r>
+    </w:p>
+    <w:p>
+      <w:pPr>
+        <w:pStyle w:val="ListParagraph"/>
+        <w:numPr>
+          <w:ilvl w:val="0"/>
+          <w:numId w:val="10"/>
+        </w:numPr>
+      </w:pPr>
+      <w:r>
+        <w:t>Smeknamn, andra namn.</w:t>
+      </w:r>
+      <w:r>
+        <w:t xml:space="preserve"> </w:t>
+      </w:r>
+    </w:p>
+    <w:p>
+      <w:pPr>
+        <w:pStyle w:val="ListParagraph"/>
+        <w:numPr>
+          <w:ilvl w:val="0"/>
+          <w:numId w:val="10"/>
+        </w:numPr>
+      </w:pPr>
+      <w:r>
+        <w:t>Gren</w:t>
+      </w:r>
+    </w:p>
+    <w:p>
+      <w:pPr>
+        <w:pStyle w:val="ListParagraph"/>
+        <w:numPr>
+          <w:ilvl w:val="0"/>
+          <w:numId w:val="10"/>
+        </w:numPr>
+      </w:pPr>
+      <w:r>
+        <w:t>färglägg</w:t>
+      </w:r>
+    </w:p>
+    <w:p>
+      <w:pPr>
+        <w:pStyle w:val="ListParagraph"/>
+        <w:ind w:left="360"/>
+      </w:pPr>
+    </w:p>
+    <w:p>
+      <w:pPr>
         <w:pStyle w:val="Heading2"/>
       </w:pPr>
       <w:r>
@@ -843,6 +1045,7 @@
         </w:numPr>
       </w:pPr>
       <w:r>
+        <w:lastRenderedPageBreak/>
         <w:t xml:space="preserve">Karta &amp; Geotaggning </w:t>
       </w:r>
       <w:r>
@@ -914,11 +1117,19 @@
           <w:lang w:val="en-US"/>
         </w:rPr>
       </w:pPr>
+      <w:proofErr w:type="spellStart"/>
       <w:r>
         <w:rPr>
           <w:lang w:val="en-US"/>
         </w:rPr>
-        <w:t>Profilbilds-skördare (Crop-to-Profile):</w:t>
+        <w:t>Profilbilds-skördare</w:t>
+      </w:r>
+      <w:proofErr w:type="spellEnd"/>
+      <w:r>
+        <w:rPr>
+          <w:lang w:val="en-US"/>
+        </w:rPr>
+        <w:t xml:space="preserve"> (Crop-to-Profile):</w:t>
       </w:r>
     </w:p>
     <w:p>
@@ -942,7 +1153,6 @@
         </w:numPr>
       </w:pPr>
       <w:r>
-        <w:lastRenderedPageBreak/>
         <w:t>En knapp "Spara som profilbild" som automatiskt beskär just det ansiktet och sparar det som personens huvudbild i släktträdet.</w:t>
       </w:r>
     </w:p>
@@ -1241,6 +1451,7 @@
         <w:pStyle w:val="Heading2"/>
       </w:pPr>
       <w:r>
+        <w:lastRenderedPageBreak/>
         <w:t>Kartregister</w:t>
       </w:r>
     </w:p>
@@ -1269,7 +1480,6 @@
         <w:pStyle w:val="Heading2"/>
       </w:pPr>
       <w:r>
-        <w:lastRenderedPageBreak/>
         <w:t>Gårdsregister</w:t>
       </w:r>
     </w:p>
@@ -1576,6 +1786,7 @@
         <w:rPr>
           <w:rFonts w:ascii="Segoe UI Symbol" w:hAnsi="Segoe UI Symbol" w:cs="Segoe UI Symbol"/>
         </w:rPr>
+        <w:lastRenderedPageBreak/>
         <w:t>🏷</w:t>
       </w:r>
       <w:r>
@@ -1619,7 +1830,6 @@
         <w:pStyle w:val="ListParagraph"/>
       </w:pPr>
       <w:r>
-        <w:lastRenderedPageBreak/>
         <w:t>Unikt värde: Ger användaren total frihet att organisera sin forskning på sitt eget sätt.</w:t>
       </w:r>
     </w:p>
@@ -1935,6 +2145,7 @@
         </w:numPr>
       </w:pPr>
       <w:r>
+        <w:lastRenderedPageBreak/>
         <w:t>Siluetter/bilder överlag kan jag inte få att visa</w:t>
       </w:r>
     </w:p>
@@ -1956,7 +2167,6 @@
         <w:pStyle w:val="Heading1"/>
       </w:pPr>
       <w:r>
-        <w:lastRenderedPageBreak/>
         <w:t xml:space="preserve">FEL </w:t>
       </w:r>
       <w:r>
@@ -2108,6 +2318,7 @@
     </w:p>
     <w:p>
       <w:r>
+        <w:lastRenderedPageBreak/>
         <w:t>[Minsta plats], [Mellanliggande område], [Region/Län/Stat], [Land]</w:t>
       </w:r>
     </w:p>
@@ -2123,7 +2334,6 @@
     </w:p>
     <w:p>
       <w:r>
-        <w:lastRenderedPageBreak/>
         <w:t>2. Sverige (Struktur &amp; Exempel)</w:t>
       </w:r>
     </w:p>
@@ -2227,12 +2437,14 @@
           <w:lang w:val="en-US"/>
         </w:rPr>
       </w:pPr>
+      <w:proofErr w:type="spellStart"/>
       <w:r>
         <w:rPr>
           <w:lang w:val="en-US"/>
         </w:rPr>
         <w:t>Formatet</w:t>
       </w:r>
+      <w:proofErr w:type="spellEnd"/>
     </w:p>
     <w:p>
       <w:pPr>
@@ -2240,11 +2452,19 @@
           <w:lang w:val="en-US"/>
         </w:rPr>
       </w:pPr>
+      <w:proofErr w:type="spellStart"/>
       <w:r>
         <w:rPr>
           <w:lang w:val="en-US"/>
         </w:rPr>
-        <w:t>Stad (City/Township), County, Stat, Land</w:t>
+        <w:t>Stad</w:t>
+      </w:r>
+      <w:proofErr w:type="spellEnd"/>
+      <w:r>
+        <w:rPr>
+          <w:lang w:val="en-US"/>
+        </w:rPr>
+        <w:t xml:space="preserve"> (City/Township), County, Stat, Land</w:t>
       </w:r>
     </w:p>
     <w:p>
@@ -2319,11 +2539,25 @@
           <w:lang w:val="en-US"/>
         </w:rPr>
         <w:tab/>
-        <w:t>Landsbygd: Chisago Lake Twp, Chisago, MN, USA</w:t>
-      </w:r>
-    </w:p>
-    <w:p>
-      <w:r>
+      </w:r>
+      <w:proofErr w:type="spellStart"/>
+      <w:r>
+        <w:rPr>
+          <w:lang w:val="en-US"/>
+        </w:rPr>
+        <w:t>Landsbygd</w:t>
+      </w:r>
+      <w:proofErr w:type="spellEnd"/>
+      <w:r>
+        <w:rPr>
+          <w:lang w:val="en-US"/>
+        </w:rPr>
+        <w:t>: Chisago Lake Twp, Chisago, MN, USA</w:t>
+      </w:r>
+    </w:p>
+    <w:p>
+      <w:r>
+        <w:lastRenderedPageBreak/>
         <w:t>________________________________________</w:t>
       </w:r>
     </w:p>
@@ -2339,7 +2573,6 @@
     </w:p>
     <w:p>
       <w:r>
-        <w:lastRenderedPageBreak/>
         <w:t>Algoritm för landsidentifiering</w:t>
       </w:r>
     </w:p>
@@ -2369,7 +2602,49 @@
           <w:lang w:val="en-US"/>
         </w:rPr>
         <w:tab/>
-        <w:t>const parts = placString.split(',').map(p =&gt; p.trim());</w:t>
+        <w:t xml:space="preserve">const parts = </w:t>
+      </w:r>
+      <w:proofErr w:type="spellStart"/>
+      <w:r>
+        <w:rPr>
+          <w:lang w:val="en-US"/>
+        </w:rPr>
+        <w:t>placString.split</w:t>
+      </w:r>
+      <w:proofErr w:type="spellEnd"/>
+      <w:r>
+        <w:rPr>
+          <w:lang w:val="en-US"/>
+        </w:rPr>
+        <w:t>(','</w:t>
+      </w:r>
+      <w:proofErr w:type="gramStart"/>
+      <w:r>
+        <w:rPr>
+          <w:lang w:val="en-US"/>
+        </w:rPr>
+        <w:t>).map</w:t>
+      </w:r>
+      <w:proofErr w:type="gramEnd"/>
+      <w:r>
+        <w:rPr>
+          <w:lang w:val="en-US"/>
+        </w:rPr>
+        <w:t xml:space="preserve">(p =&gt; </w:t>
+      </w:r>
+      <w:proofErr w:type="spellStart"/>
+      <w:r>
+        <w:rPr>
+          <w:lang w:val="en-US"/>
+        </w:rPr>
+        <w:t>p.trim</w:t>
+      </w:r>
+      <w:proofErr w:type="spellEnd"/>
+      <w:r>
+        <w:rPr>
+          <w:lang w:val="en-US"/>
+        </w:rPr>
+        <w:t>());</w:t>
       </w:r>
     </w:p>
     <w:p>

</xml_diff>

<commit_message>
feat: Enhance relationship calculations and UI components
- Added gender handling in RelationshipPath for determining familial terms (mother, father, daughter, son) based on gender.
- Introduced new utility functions in relationshipUtils.js for extracting parent and child IDs from person relations.
- Implemented advanced relationship calculation logic to identify various familial relationships, including spouses, siblings, cousins, and more.
- Updated WindowFrame component to support docking functionality on the right side of the screen.
- Added CSS for Leaflet in main.jsx for improved map rendering.
- Created comprehensive tests for GEDCOM export functionality and relationship calculations to ensure accuracy and reliability.
- Introduced audit and merge JSON files for tracking changes and merges in the application.
</commit_message>
<xml_diff>
--- a/docs/släktträd.docx
+++ b/docs/släktträd.docx
@@ -793,9 +793,21 @@
           <w:ilvl w:val="0"/>
           <w:numId w:val="10"/>
         </w:numPr>
-      </w:pPr>
-      <w:r>
+        <w:rPr>
+          <w:strike/>
+        </w:rPr>
+      </w:pPr>
+      <w:r>
+        <w:rPr>
+          <w:strike/>
+        </w:rPr>
         <w:t>Bokmärke</w:t>
+      </w:r>
+      <w:r>
+        <w:rPr>
+          <w:strike/>
+        </w:rPr>
+        <w:t xml:space="preserve"> samt bokmärkes knapp för att visa bokmärkta folk</w:t>
       </w:r>
     </w:p>
     <w:p>
@@ -805,13 +817,20 @@
           <w:ilvl w:val="0"/>
           <w:numId w:val="10"/>
         </w:numPr>
-      </w:pPr>
-      <w:r>
+        <w:rPr>
+          <w:strike/>
+        </w:rPr>
+      </w:pPr>
+      <w:r>
+        <w:rPr>
+          <w:strike/>
+        </w:rPr>
         <w:t xml:space="preserve">Relationskalkylator ("Hur är vi släkt?") </w:t>
       </w:r>
       <w:r>
         <w:rPr>
           <w:rFonts w:ascii="Segoe UI Emoji" w:hAnsi="Segoe UI Emoji" w:cs="Segoe UI Emoji"/>
+          <w:strike/>
         </w:rPr>
         <w:t>🧮</w:t>
       </w:r>
@@ -823,9 +842,21 @@
           <w:ilvl w:val="1"/>
           <w:numId w:val="10"/>
         </w:numPr>
-      </w:pPr>
-      <w:r>
+        <w:rPr>
+          <w:strike/>
+        </w:rPr>
+      </w:pPr>
+      <w:r>
+        <w:rPr>
+          <w:strike/>
+        </w:rPr>
         <w:t>Idé: Du väljer Person A (dig själv) och Person B (en avlägsen släkting).</w:t>
+      </w:r>
+      <w:r>
+        <w:rPr>
+          <w:strike/>
+        </w:rPr>
+        <w:t xml:space="preserve"> Detta finns redan.</w:t>
       </w:r>
     </w:p>
     <w:p>
@@ -835,9 +866,21 @@
           <w:ilvl w:val="1"/>
           <w:numId w:val="10"/>
         </w:numPr>
-      </w:pPr>
-      <w:r>
+        <w:rPr>
+          <w:strike/>
+        </w:rPr>
+      </w:pPr>
+      <w:r>
+        <w:rPr>
+          <w:strike/>
+        </w:rPr>
         <w:t>Resultat: Appen räknar ut den kortaste vägen och säger: "Ni är bryllingar (fyrmänningar). Er gemensamma ana är Per Persson född 1750."</w:t>
+      </w:r>
+      <w:r>
+        <w:rPr>
+          <w:strike/>
+        </w:rPr>
+        <w:t xml:space="preserve"> Visar ”vägen” mellan er två, dvs allas läktingar mellan er!</w:t>
       </w:r>
     </w:p>
     <w:p>
@@ -847,9 +890,21 @@
           <w:ilvl w:val="1"/>
           <w:numId w:val="10"/>
         </w:numPr>
-      </w:pPr>
-      <w:r>
+        <w:rPr>
+          <w:strike/>
+        </w:rPr>
+      </w:pPr>
+      <w:r>
+        <w:rPr>
+          <w:strike/>
+        </w:rPr>
         <w:t>Gren</w:t>
+      </w:r>
+      <w:r>
+        <w:rPr>
+          <w:strike/>
+        </w:rPr>
+        <w:t>. Kiunna namnge en gren och tagga personer som anor, ättlingar till den.</w:t>
       </w:r>
     </w:p>
     <w:p>
@@ -859,9 +914,33 @@
           <w:ilvl w:val="1"/>
           <w:numId w:val="10"/>
         </w:numPr>
-      </w:pPr>
-      <w:r>
-        <w:t>färglägg</w:t>
+        <w:rPr>
+          <w:strike/>
+        </w:rPr>
+      </w:pPr>
+      <w:r>
+        <w:rPr>
+          <w:strike/>
+        </w:rPr>
+        <w:t>F</w:t>
+      </w:r>
+      <w:r>
+        <w:rPr>
+          <w:strike/>
+        </w:rPr>
+        <w:t>ärglägg</w:t>
+      </w:r>
+      <w:r>
+        <w:rPr>
+          <w:strike/>
+        </w:rPr>
+        <w:t>, kunna färglägga</w:t>
+      </w:r>
+      <w:r>
+        <w:rPr>
+          <w:strike/>
+        </w:rPr>
+        <w:t xml:space="preserve"> personer som anor, ättlingar till den.</w:t>
       </w:r>
     </w:p>
     <w:p>
@@ -879,9 +958,21 @@
           <w:ilvl w:val="0"/>
           <w:numId w:val="10"/>
         </w:numPr>
-      </w:pPr>
-      <w:r>
+        <w:rPr>
+          <w:strike/>
+        </w:rPr>
+      </w:pPr>
+      <w:r>
+        <w:rPr>
+          <w:strike/>
+        </w:rPr>
         <w:t>Bokmärke</w:t>
+      </w:r>
+      <w:r>
+        <w:rPr>
+          <w:strike/>
+        </w:rPr>
+        <w:t>s knapp</w:t>
       </w:r>
     </w:p>
     <w:p>
@@ -891,8 +982,14 @@
           <w:ilvl w:val="0"/>
           <w:numId w:val="10"/>
         </w:numPr>
-      </w:pPr>
-      <w:r>
+        <w:rPr>
+          <w:strike/>
+        </w:rPr>
+      </w:pPr>
+      <w:r>
+        <w:rPr>
+          <w:strike/>
+        </w:rPr>
         <w:t>Ai historia om en person.</w:t>
       </w:r>
     </w:p>
@@ -903,8 +1000,14 @@
           <w:ilvl w:val="0"/>
           <w:numId w:val="10"/>
         </w:numPr>
-      </w:pPr>
-      <w:r>
+        <w:rPr>
+          <w:strike/>
+        </w:rPr>
+      </w:pPr>
+      <w:r>
+        <w:rPr>
+          <w:strike/>
+        </w:rPr>
         <w:t>Exportera bilder</w:t>
       </w:r>
     </w:p>
@@ -915,8 +1018,14 @@
           <w:ilvl w:val="0"/>
           <w:numId w:val="10"/>
         </w:numPr>
-      </w:pPr>
-      <w:r>
+        <w:rPr>
+          <w:strike/>
+        </w:rPr>
+      </w:pPr>
+      <w:r>
+        <w:rPr>
+          <w:strike/>
+        </w:rPr>
         <w:t>Alla händelser ska sorteras efter datum.</w:t>
       </w:r>
     </w:p>
@@ -927,9 +1036,21 @@
           <w:ilvl w:val="0"/>
           <w:numId w:val="10"/>
         </w:numPr>
-      </w:pPr>
-      <w:r>
-        <w:t>Personnummer: Ska vara sifferbaserat.</w:t>
+        <w:rPr>
+          <w:strike/>
+        </w:rPr>
+      </w:pPr>
+      <w:r>
+        <w:rPr>
+          <w:strike/>
+        </w:rPr>
+        <w:t>Smeknamn, andra namn.</w:t>
+      </w:r>
+      <w:r>
+        <w:rPr>
+          <w:strike/>
+        </w:rPr>
+        <w:t xml:space="preserve"> </w:t>
       </w:r>
     </w:p>
     <w:p>
@@ -939,9 +1060,21 @@
           <w:ilvl w:val="0"/>
           <w:numId w:val="10"/>
         </w:numPr>
-      </w:pPr>
-      <w:r>
-        <w:t>Född som (namn)</w:t>
+        <w:rPr>
+          <w:strike/>
+        </w:rPr>
+      </w:pPr>
+      <w:r>
+        <w:rPr>
+          <w:strike/>
+        </w:rPr>
+        <w:t>Gren</w:t>
+      </w:r>
+      <w:r>
+        <w:rPr>
+          <w:strike/>
+        </w:rPr>
+        <w:t>, se vilken gren man tillhör om man är tillagd.</w:t>
       </w:r>
     </w:p>
     <w:p>
@@ -951,12 +1084,39 @@
           <w:ilvl w:val="0"/>
           <w:numId w:val="10"/>
         </w:numPr>
-      </w:pPr>
-      <w:r>
-        <w:t>Smeknamn, andra namn.</w:t>
-      </w:r>
-      <w:r>
-        <w:t xml:space="preserve"> </w:t>
+        <w:rPr>
+          <w:strike/>
+        </w:rPr>
+      </w:pPr>
+      <w:r>
+        <w:rPr>
+          <w:strike/>
+        </w:rPr>
+        <w:t>F</w:t>
+      </w:r>
+      <w:r>
+        <w:rPr>
+          <w:strike/>
+        </w:rPr>
+        <w:t>ärglägg</w:t>
+      </w:r>
+      <w:r>
+        <w:rPr>
+          <w:strike/>
+        </w:rPr>
+        <w:t xml:space="preserve">, se vilken </w:t>
+      </w:r>
+      <w:r>
+        <w:rPr>
+          <w:strike/>
+        </w:rPr>
+        <w:t>färg</w:t>
+      </w:r>
+      <w:r>
+        <w:rPr>
+          <w:strike/>
+        </w:rPr>
+        <w:t xml:space="preserve"> man tillhör om man är tillagd.</w:t>
       </w:r>
     </w:p>
     <w:p>
@@ -966,9 +1126,15 @@
           <w:ilvl w:val="0"/>
           <w:numId w:val="10"/>
         </w:numPr>
-      </w:pPr>
-      <w:r>
-        <w:t>Gren</w:t>
+        <w:rPr>
+          <w:strike/>
+        </w:rPr>
+      </w:pPr>
+      <w:r>
+        <w:rPr>
+          <w:strike/>
+        </w:rPr>
+        <w:t>Docka till höger med en knapp brevid minimera knappen.</w:t>
       </w:r>
     </w:p>
     <w:p>
@@ -978,11 +1144,44 @@
           <w:ilvl w:val="0"/>
           <w:numId w:val="10"/>
         </w:numPr>
-      </w:pPr>
-      <w:r>
-        <w:t>färglägg</w:t>
-      </w:r>
-    </w:p>
+        <w:rPr>
+          <w:strike/>
+        </w:rPr>
+      </w:pPr>
+      <w:r>
+        <w:rPr>
+          <w:strike/>
+        </w:rPr>
+        <w:t>Ref Nr</w:t>
+      </w:r>
+      <w:r>
+        <w:rPr>
+          <w:strike/>
+        </w:rPr>
+        <w:t>, knapp brevid som kopierar numret.</w:t>
+      </w:r>
+    </w:p>
+    <w:p>
+      <w:pPr>
+        <w:pStyle w:val="ListParagraph"/>
+        <w:numPr>
+          <w:ilvl w:val="0"/>
+          <w:numId w:val="10"/>
+        </w:numPr>
+      </w:pPr>
+      <w:r>
+        <w:t>Till släktträdet (Personen som fokus)</w:t>
+      </w:r>
+    </w:p>
+    <w:p>
+      <w:pPr>
+        <w:pStyle w:val="Heading3"/>
+      </w:pPr>
+      <w:r>
+        <w:t>Händelsetyper:</w:t>
+      </w:r>
+    </w:p>
+    <w:p/>
     <w:p>
       <w:pPr>
         <w:pStyle w:val="ListParagraph"/>
@@ -1009,6 +1208,7 @@
     </w:p>
     <w:p>
       <w:r>
+        <w:lastRenderedPageBreak/>
         <w:t>-Om en bild är 1000x1000 men facetaggen till personen är 50x50 så är det det som visas i profilbilden</w:t>
       </w:r>
     </w:p>
@@ -1045,7 +1245,6 @@
         </w:numPr>
       </w:pPr>
       <w:r>
-        <w:lastRenderedPageBreak/>
         <w:t xml:space="preserve">Karta &amp; Geotaggning </w:t>
       </w:r>
       <w:r>
@@ -1229,6 +1428,19 @@
         <w:pStyle w:val="Heading2"/>
       </w:pPr>
       <w:r>
+        <w:t>GEDCOM</w:t>
+      </w:r>
+    </w:p>
+    <w:p>
+      <w:r>
+        <w:t>REFnr ska kunna importeras till appens ref nr!</w:t>
+      </w:r>
+    </w:p>
+    <w:p>
+      <w:pPr>
+        <w:pStyle w:val="Heading2"/>
+      </w:pPr>
+      <w:r>
         <w:t>Kyrkogårdar</w:t>
       </w:r>
     </w:p>
@@ -1420,6 +1632,7 @@
         </w:numPr>
       </w:pPr>
       <w:r>
+        <w:lastRenderedPageBreak/>
         <w:t>Länka till personer samt platser, källor</w:t>
       </w:r>
     </w:p>
@@ -1451,7 +1664,6 @@
         <w:pStyle w:val="Heading2"/>
       </w:pPr>
       <w:r>
-        <w:lastRenderedPageBreak/>
         <w:t>Kartregister</w:t>
       </w:r>
     </w:p>
@@ -1724,6 +1936,7 @@
         <w:pStyle w:val="ListParagraph"/>
       </w:pPr>
       <w:r>
+        <w:lastRenderedPageBreak/>
         <w:t>Unikt värde: Förvandlar data till en saga som barnbarnen faktiskt vill läsa.</w:t>
       </w:r>
     </w:p>
@@ -1786,7 +1999,6 @@
         <w:rPr>
           <w:rFonts w:ascii="Segoe UI Symbol" w:hAnsi="Segoe UI Symbol" w:cs="Segoe UI Symbol"/>
         </w:rPr>
-        <w:lastRenderedPageBreak/>
         <w:t>🏷</w:t>
       </w:r>
       <w:r>
@@ -2145,7 +2357,6 @@
         </w:numPr>
       </w:pPr>
       <w:r>
-        <w:lastRenderedPageBreak/>
         <w:t>Siluetter/bilder överlag kan jag inte få att visa</w:t>
       </w:r>
     </w:p>
@@ -2299,6 +2510,7 @@
     </w:p>
     <w:p>
       <w:r>
+        <w:lastRenderedPageBreak/>
         <w:t>Om man importerar en GEDCOM så ska dem synkas med den officiella ELLER användarens egna platser. Dem som inte matchar ska hamna i en flik som heter ”Rätta” med passande ikon, på den fliken ska där stå antal som behöver redigeras. I fliken ska man kunna söka i fritex samt att där finns en knapp som heter koppla där man kan skriva i plats id elelr söka fritext och dela upp strängen efter lään, kommun, församling, ort osv.</w:t>
       </w:r>
       <w:r>
@@ -2318,7 +2530,6 @@
     </w:p>
     <w:p>
       <w:r>
-        <w:lastRenderedPageBreak/>
         <w:t>[Minsta plats], [Mellanliggande område], [Region/Län/Stat], [Land]</w:t>
       </w:r>
     </w:p>
@@ -2483,6 +2694,7 @@
     </w:p>
     <w:p>
       <w:r>
+        <w:lastRenderedPageBreak/>
         <w:t>2.</w:t>
       </w:r>
       <w:r>
@@ -2557,7 +2769,6 @@
     </w:p>
     <w:p>
       <w:r>
-        <w:lastRenderedPageBreak/>
         <w:t>________________________________________</w:t>
       </w:r>
     </w:p>
@@ -2789,6 +3000,7 @@
     </w:p>
     <w:p>
       <w:r>
+        <w:lastRenderedPageBreak/>
         <w:t>Nivå 1</w:t>
       </w:r>
       <w:r>
@@ -5541,7 +5753,6 @@
   <w:style w:type="character" w:default="1" w:styleId="DefaultParagraphFont">
     <w:name w:val="Default Paragraph Font"/>
     <w:uiPriority w:val="1"/>
-    <w:semiHidden/>
     <w:unhideWhenUsed/>
   </w:style>
   <w:style w:type="table" w:default="1" w:styleId="TableNormal">

</xml_diff>

<commit_message>
feat: add image utility functions for face tagging and avatar styling
- Implemented `toValidPercent` to ensure valid percentage values.
- Created `normalizeFaceTagRect` to normalize face tag rectangle dimensions.
- Added `findFaceTagForPerson` to retrieve face tags associated with a specific person.
- Developed `getAvatarImageStyle` to compute avatar image styles based on face tag positions.
</commit_message>
<xml_diff>
--- a/docs/släktträd.docx
+++ b/docs/släktträd.docx
@@ -40,57 +40,53 @@
         <w:rPr>
           <w:lang w:val="en-US"/>
         </w:rPr>
-        <w:t>React/Electron → (HTTP-</w:t>
-      </w:r>
-      <w:proofErr w:type="spellStart"/>
-      <w:r>
+        <w:t>React/Electron → (HTTP-anrop, t.ex. fetch) → Flask (Python) → (SQL) → SQLite-databas</w:t>
+      </w:r>
+    </w:p>
+    <w:p>
+      <w:pPr>
+        <w:pStyle w:val="Heading1"/>
         <w:rPr>
           <w:lang w:val="en-US"/>
         </w:rPr>
-        <w:t>anrop</w:t>
-      </w:r>
-      <w:proofErr w:type="spellEnd"/>
+      </w:pPr>
       <w:r>
         <w:rPr>
           <w:lang w:val="en-US"/>
         </w:rPr>
-        <w:t xml:space="preserve">, </w:t>
-      </w:r>
-      <w:proofErr w:type="spellStart"/>
-      <w:r>
+        <w:t>STARTA SERVER &amp; ELECTRON</w:t>
+      </w:r>
+    </w:p>
+    <w:p>
+      <w:pPr>
         <w:rPr>
           <w:lang w:val="en-US"/>
         </w:rPr>
-        <w:t>t.ex</w:t>
-      </w:r>
-      <w:proofErr w:type="spellEnd"/>
+      </w:pPr>
       <w:r>
         <w:rPr>
           <w:lang w:val="en-US"/>
         </w:rPr>
-        <w:t>. fetch) → Flask (Python) → (SQL) → SQLite-</w:t>
-      </w:r>
-      <w:proofErr w:type="spellStart"/>
-      <w:r>
+        <w:t>C:\Users\denni\Documents\Dennis\programmering\WestFamilyTree\WestFamilyTree&gt; npm run dev</w:t>
+      </w:r>
+    </w:p>
+    <w:p>
+      <w:pPr>
         <w:rPr>
           <w:lang w:val="en-US"/>
         </w:rPr>
-        <w:t>databas</w:t>
-      </w:r>
-      <w:proofErr w:type="spellEnd"/>
-    </w:p>
-    <w:p>
-      <w:pPr>
-        <w:pStyle w:val="Heading1"/>
+      </w:pPr>
+      <w:r>
         <w:rPr>
           <w:lang w:val="en-US"/>
         </w:rPr>
-      </w:pPr>
+        <w:t xml:space="preserve">C:\Users\denni\Documents\Dennis\programmering\WestFamilyTree\WestFamilyTree&gt; </w:t>
+      </w:r>
       <w:r>
         <w:rPr>
           <w:lang w:val="en-US"/>
         </w:rPr>
-        <w:t>STARTA SERVER &amp; ELECTRON</w:t>
+        <w:t>python api_server_cors.py</w:t>
       </w:r>
     </w:p>
     <w:p>
@@ -105,84 +101,30 @@
         </w:rPr>
         <w:t xml:space="preserve">C:\Users\denni\Documents\Dennis\programmering\WestFamilyTree\WestFamilyTree&gt; </w:t>
       </w:r>
-      <w:proofErr w:type="spellStart"/>
       <w:r>
         <w:rPr>
           <w:lang w:val="en-US"/>
         </w:rPr>
-        <w:t>npm</w:t>
-      </w:r>
-      <w:proofErr w:type="spellEnd"/>
-      <w:r>
+        <w:t>python oai_proxy.py</w:t>
+      </w:r>
+    </w:p>
+    <w:p>
+      <w:pPr>
         <w:rPr>
           <w:lang w:val="en-US"/>
         </w:rPr>
-        <w:t xml:space="preserve"> run dev</w:t>
-      </w:r>
-    </w:p>
-    <w:p>
-      <w:pPr>
+      </w:pPr>
+      <w:r>
         <w:rPr>
           <w:lang w:val="en-US"/>
         </w:rPr>
-      </w:pPr>
+        <w:t xml:space="preserve">C:\Users\denni\Documents\Dennis\programmering\WestFamilyTree\WestFamilyTree&gt; </w:t>
+      </w:r>
       <w:r>
         <w:rPr>
           <w:lang w:val="en-US"/>
         </w:rPr>
-        <w:t xml:space="preserve">C:\Users\denni\Documents\Dennis\programmering\WestFamilyTree\WestFamilyTree&gt; </w:t>
-      </w:r>
-      <w:r>
-        <w:rPr>
-          <w:lang w:val="en-US"/>
-        </w:rPr>
-        <w:t>python api_server_cors.py</w:t>
-      </w:r>
-    </w:p>
-    <w:p>
-      <w:pPr>
-        <w:rPr>
-          <w:lang w:val="en-US"/>
-        </w:rPr>
-      </w:pPr>
-      <w:r>
-        <w:rPr>
-          <w:lang w:val="en-US"/>
-        </w:rPr>
-        <w:t xml:space="preserve">C:\Users\denni\Documents\Dennis\programmering\WestFamilyTree\WestFamilyTree&gt; </w:t>
-      </w:r>
-      <w:r>
-        <w:rPr>
-          <w:lang w:val="en-US"/>
-        </w:rPr>
-        <w:t>python oai_proxy.py</w:t>
-      </w:r>
-    </w:p>
-    <w:p>
-      <w:pPr>
-        <w:rPr>
-          <w:lang w:val="en-US"/>
-        </w:rPr>
-      </w:pPr>
-      <w:r>
-        <w:rPr>
-          <w:lang w:val="en-US"/>
-        </w:rPr>
-        <w:t xml:space="preserve">C:\Users\denni\Documents\Dennis\programmering\WestFamilyTree\WestFamilyTree&gt; </w:t>
-      </w:r>
-      <w:proofErr w:type="spellStart"/>
-      <w:r>
-        <w:rPr>
-          <w:lang w:val="en-US"/>
-        </w:rPr>
-        <w:t>npm</w:t>
-      </w:r>
-      <w:proofErr w:type="spellEnd"/>
-      <w:r>
-        <w:rPr>
-          <w:lang w:val="en-US"/>
-        </w:rPr>
-        <w:t xml:space="preserve"> run electron</w:t>
+        <w:t>npm run electron</w:t>
       </w:r>
     </w:p>
     <w:p>
@@ -945,6 +887,60 @@
     </w:p>
     <w:p>
       <w:pPr>
+        <w:pStyle w:val="ListParagraph"/>
+        <w:numPr>
+          <w:ilvl w:val="1"/>
+          <w:numId w:val="10"/>
+        </w:numPr>
+      </w:pPr>
+      <w:r>
+        <w:t>Kolummner:</w:t>
+      </w:r>
+    </w:p>
+    <w:p>
+      <w:pPr>
+        <w:pStyle w:val="ListParagraph"/>
+        <w:numPr>
+          <w:ilvl w:val="2"/>
+          <w:numId w:val="10"/>
+        </w:numPr>
+        <w:rPr>
+          <w:strike/>
+        </w:rPr>
+      </w:pPr>
+      <w:r>
+        <w:t xml:space="preserve">Ref nr, Kön, </w:t>
+      </w:r>
+      <w:r>
+        <w:t>F.</w:t>
+      </w:r>
+      <w:r>
+        <w:t xml:space="preserve">Namn, </w:t>
+      </w:r>
+      <w:r>
+        <w:t xml:space="preserve">E.Namn, </w:t>
+      </w:r>
+      <w:r>
+        <w:t>Född (Datum), Född (Plats)</w:t>
+      </w:r>
+      <w:r>
+        <w:t>, Död</w:t>
+      </w:r>
+      <w:r>
+        <w:t xml:space="preserve"> (Datum), </w:t>
+      </w:r>
+      <w:r>
+        <w:t>Död</w:t>
+      </w:r>
+      <w:r>
+        <w:t xml:space="preserve"> (Plats)</w:t>
+      </w:r>
+      <w:r>
+        <w:t>, Yrke, Träd, Gren, Färgkod,</w:t>
+      </w:r>
+    </w:p>
+    <w:p>
+      <w:pPr>
         <w:pStyle w:val="Heading2"/>
       </w:pPr>
       <w:r>
@@ -1168,9 +1164,178 @@
           <w:ilvl w:val="0"/>
           <w:numId w:val="10"/>
         </w:numPr>
-      </w:pPr>
-      <w:r>
-        <w:t>Till släktträdet (Personen som fokus)</w:t>
+        <w:rPr>
+          <w:strike/>
+        </w:rPr>
+      </w:pPr>
+      <w:r>
+        <w:rPr>
+          <w:strike/>
+        </w:rPr>
+        <w:t>Lägga till en ikon i editpersonmodal samt i personregistret som tar en t</w:t>
+      </w:r>
+      <w:r>
+        <w:rPr>
+          <w:strike/>
+        </w:rPr>
+        <w:t>ill släktträdet (Personen som fokus)</w:t>
+      </w:r>
+    </w:p>
+    <w:p>
+      <w:pPr>
+        <w:pStyle w:val="ListParagraph"/>
+        <w:numPr>
+          <w:ilvl w:val="0"/>
+          <w:numId w:val="10"/>
+        </w:numPr>
+        <w:rPr>
+          <w:strike/>
+        </w:rPr>
+      </w:pPr>
+      <w:r>
+        <w:rPr>
+          <w:strike/>
+        </w:rPr>
+        <w:t>Man ska kunna byta typ på ”</w:t>
+      </w:r>
+      <w:r>
+        <w:rPr>
+          <w:strike/>
+        </w:rPr>
+        <w:t>Händelse</w:t>
+      </w:r>
+      <w:r>
+        <w:rPr>
+          <w:strike/>
+        </w:rPr>
+        <w:t>” Så dop blir bostad. En varning med Vittnen eller</w:t>
+      </w:r>
+      <w:r>
+        <w:rPr>
+          <w:strike/>
+        </w:rPr>
+        <w:t xml:space="preserve"> </w:t>
+      </w:r>
+      <w:r>
+        <w:rPr>
+          <w:strike/>
+        </w:rPr>
+        <w:t xml:space="preserve">länkade personer måste </w:t>
+      </w:r>
+      <w:r>
+        <w:rPr>
+          <w:strike/>
+        </w:rPr>
+        <w:t>bekräfta att detta kommer att rader</w:t>
+      </w:r>
+      <w:r>
+        <w:rPr>
+          <w:strike/>
+        </w:rPr>
+        <w:t>a</w:t>
+      </w:r>
+      <w:r>
+        <w:rPr>
+          <w:strike/>
+        </w:rPr>
+        <w:t>s om man byter typ.</w:t>
+      </w:r>
+      <w:r>
+        <w:rPr>
+          <w:strike/>
+        </w:rPr>
+        <w:t xml:space="preserve"> Källor, notiser, datum samt bilder ska flyttas med.</w:t>
+      </w:r>
+    </w:p>
+    <w:p>
+      <w:pPr>
+        <w:pStyle w:val="ListParagraph"/>
+        <w:numPr>
+          <w:ilvl w:val="0"/>
+          <w:numId w:val="10"/>
+        </w:numPr>
+        <w:rPr>
+          <w:strike/>
+        </w:rPr>
+      </w:pPr>
+      <w:r>
+        <w:t>När man trycker högerknappen på en livshändelse så ska där komma menyval som:</w:t>
+      </w:r>
+    </w:p>
+    <w:p>
+      <w:pPr>
+        <w:pStyle w:val="ListParagraph"/>
+        <w:numPr>
+          <w:ilvl w:val="1"/>
+          <w:numId w:val="10"/>
+        </w:numPr>
+        <w:rPr>
+          <w:strike/>
+        </w:rPr>
+      </w:pPr>
+      <w:r>
+        <w:t>Kopiera källa</w:t>
+      </w:r>
+    </w:p>
+    <w:p>
+      <w:pPr>
+        <w:pStyle w:val="ListParagraph"/>
+        <w:numPr>
+          <w:ilvl w:val="1"/>
+          <w:numId w:val="10"/>
+        </w:numPr>
+        <w:rPr>
+          <w:strike/>
+        </w:rPr>
+      </w:pPr>
+      <w:r>
+        <w:t>Klista in källa</w:t>
+      </w:r>
+    </w:p>
+    <w:p>
+      <w:pPr>
+        <w:pStyle w:val="ListParagraph"/>
+        <w:numPr>
+          <w:ilvl w:val="1"/>
+          <w:numId w:val="10"/>
+        </w:numPr>
+        <w:rPr>
+          <w:strike/>
+        </w:rPr>
+      </w:pPr>
+      <w:r>
+        <w:lastRenderedPageBreak/>
+        <w:t>Radera händelse</w:t>
+      </w:r>
+    </w:p>
+    <w:p>
+      <w:pPr>
+        <w:pStyle w:val="ListParagraph"/>
+        <w:numPr>
+          <w:ilvl w:val="1"/>
+          <w:numId w:val="10"/>
+        </w:numPr>
+        <w:rPr>
+          <w:strike/>
+        </w:rPr>
+      </w:pPr>
+      <w:r>
+        <w:t>Redigera händelse</w:t>
+      </w:r>
+    </w:p>
+    <w:p>
+      <w:pPr>
+        <w:pStyle w:val="ListParagraph"/>
+        <w:numPr>
+          <w:ilvl w:val="1"/>
+          <w:numId w:val="10"/>
+        </w:numPr>
+        <w:rPr>
+          <w:strike/>
+        </w:rPr>
+      </w:pPr>
+      <w:r>
+        <w:t>Byt händelse</w:t>
       </w:r>
     </w:p>
     <w:p>
@@ -1208,7 +1373,6 @@
     </w:p>
     <w:p>
       <w:r>
-        <w:lastRenderedPageBreak/>
         <w:t>-Om en bild är 1000x1000 men facetaggen till personen är 50x50 så är det det som visas i profilbilden</w:t>
       </w:r>
     </w:p>
@@ -1316,19 +1480,11 @@
           <w:lang w:val="en-US"/>
         </w:rPr>
       </w:pPr>
-      <w:proofErr w:type="spellStart"/>
       <w:r>
         <w:rPr>
           <w:lang w:val="en-US"/>
         </w:rPr>
-        <w:t>Profilbilds-skördare</w:t>
-      </w:r>
-      <w:proofErr w:type="spellEnd"/>
-      <w:r>
-        <w:rPr>
-          <w:lang w:val="en-US"/>
-        </w:rPr>
-        <w:t xml:space="preserve"> (Crop-to-Profile):</w:t>
+        <w:t>Profilbilds-skördare (Crop-to-Profile):</w:t>
       </w:r>
     </w:p>
     <w:p>
@@ -1491,6 +1647,7 @@
         </w:numPr>
       </w:pPr>
       <w:r>
+        <w:lastRenderedPageBreak/>
         <w:t>Minikarta i nedre högra hörnet</w:t>
       </w:r>
     </w:p>
@@ -1632,7 +1789,6 @@
         </w:numPr>
       </w:pPr>
       <w:r>
-        <w:lastRenderedPageBreak/>
         <w:t>Länka till personer samt platser, källor</w:t>
       </w:r>
     </w:p>
@@ -1863,6 +2019,7 @@
         </w:numPr>
       </w:pPr>
       <w:r>
+        <w:lastRenderedPageBreak/>
         <w:t>Namn-standardisering: Ett verktyg som hittar alla varianter av "Pehr", "Pär", "Per" och föreslår en standardisering.</w:t>
       </w:r>
     </w:p>
@@ -1936,7 +2093,6 @@
         <w:pStyle w:val="ListParagraph"/>
       </w:pPr>
       <w:r>
-        <w:lastRenderedPageBreak/>
         <w:t>Unikt värde: Förvandlar data till en saga som barnbarnen faktiskt vill läsa.</w:t>
       </w:r>
     </w:p>
@@ -2427,6 +2583,7 @@
         <w:pStyle w:val="Heading1"/>
       </w:pPr>
       <w:r>
+        <w:lastRenderedPageBreak/>
         <w:t xml:space="preserve">FEL </w:t>
       </w:r>
       <w:r>
@@ -2510,7 +2667,6 @@
     </w:p>
     <w:p>
       <w:r>
-        <w:lastRenderedPageBreak/>
         <w:t>Om man importerar en GEDCOM så ska dem synkas med den officiella ELLER användarens egna platser. Dem som inte matchar ska hamna i en flik som heter ”Rätta” med passande ikon, på den fliken ska där stå antal som behöver redigeras. I fliken ska man kunna söka i fritex samt att där finns en knapp som heter koppla där man kan skriva i plats id elelr söka fritext och dela upp strängen efter lään, kommun, församling, ort osv.</w:t>
       </w:r>
       <w:r>
@@ -2620,6 +2776,7 @@
     </w:p>
     <w:p>
       <w:r>
+        <w:lastRenderedPageBreak/>
         <w:t>•</w:t>
       </w:r>
       <w:r>
@@ -2648,14 +2805,12 @@
           <w:lang w:val="en-US"/>
         </w:rPr>
       </w:pPr>
-      <w:proofErr w:type="spellStart"/>
       <w:r>
         <w:rPr>
           <w:lang w:val="en-US"/>
         </w:rPr>
         <w:t>Formatet</w:t>
       </w:r>
-      <w:proofErr w:type="spellEnd"/>
     </w:p>
     <w:p>
       <w:pPr>
@@ -2663,19 +2818,11 @@
           <w:lang w:val="en-US"/>
         </w:rPr>
       </w:pPr>
-      <w:proofErr w:type="spellStart"/>
       <w:r>
         <w:rPr>
           <w:lang w:val="en-US"/>
         </w:rPr>
-        <w:t>Stad</w:t>
-      </w:r>
-      <w:proofErr w:type="spellEnd"/>
-      <w:r>
-        <w:rPr>
-          <w:lang w:val="en-US"/>
-        </w:rPr>
-        <w:t xml:space="preserve"> (City/Township), County, Stat, Land</w:t>
+        <w:t>Stad (City/Township), County, Stat, Land</w:t>
       </w:r>
     </w:p>
     <w:p>
@@ -2694,7 +2841,6 @@
     </w:p>
     <w:p>
       <w:r>
-        <w:lastRenderedPageBreak/>
         <w:t>2.</w:t>
       </w:r>
       <w:r>
@@ -2751,20 +2897,7 @@
           <w:lang w:val="en-US"/>
         </w:rPr>
         <w:tab/>
-      </w:r>
-      <w:proofErr w:type="spellStart"/>
-      <w:r>
-        <w:rPr>
-          <w:lang w:val="en-US"/>
-        </w:rPr>
-        <w:t>Landsbygd</w:t>
-      </w:r>
-      <w:proofErr w:type="spellEnd"/>
-      <w:r>
-        <w:rPr>
-          <w:lang w:val="en-US"/>
-        </w:rPr>
-        <w:t>: Chisago Lake Twp, Chisago, MN, USA</w:t>
+        <w:t>Landsbygd: Chisago Lake Twp, Chisago, MN, USA</w:t>
       </w:r>
     </w:p>
     <w:p>
@@ -2813,49 +2946,7 @@
           <w:lang w:val="en-US"/>
         </w:rPr>
         <w:tab/>
-        <w:t xml:space="preserve">const parts = </w:t>
-      </w:r>
-      <w:proofErr w:type="spellStart"/>
-      <w:r>
-        <w:rPr>
-          <w:lang w:val="en-US"/>
-        </w:rPr>
-        <w:t>placString.split</w:t>
-      </w:r>
-      <w:proofErr w:type="spellEnd"/>
-      <w:r>
-        <w:rPr>
-          <w:lang w:val="en-US"/>
-        </w:rPr>
-        <w:t>(','</w:t>
-      </w:r>
-      <w:proofErr w:type="gramStart"/>
-      <w:r>
-        <w:rPr>
-          <w:lang w:val="en-US"/>
-        </w:rPr>
-        <w:t>).map</w:t>
-      </w:r>
-      <w:proofErr w:type="gramEnd"/>
-      <w:r>
-        <w:rPr>
-          <w:lang w:val="en-US"/>
-        </w:rPr>
-        <w:t xml:space="preserve">(p =&gt; </w:t>
-      </w:r>
-      <w:proofErr w:type="spellStart"/>
-      <w:r>
-        <w:rPr>
-          <w:lang w:val="en-US"/>
-        </w:rPr>
-        <w:t>p.trim</w:t>
-      </w:r>
-      <w:proofErr w:type="spellEnd"/>
-      <w:r>
-        <w:rPr>
-          <w:lang w:val="en-US"/>
-        </w:rPr>
-        <w:t>());</w:t>
+        <w:t>const parts = placString.split(',').map(p =&gt; p.trim());</w:t>
       </w:r>
     </w:p>
     <w:p>
@@ -2928,6 +3019,7 @@
     </w:p>
     <w:p>
       <w:r>
+        <w:lastRenderedPageBreak/>
         <w:t>•</w:t>
       </w:r>
       <w:r>
@@ -3000,7 +3092,6 @@
     </w:p>
     <w:p>
       <w:r>
-        <w:lastRenderedPageBreak/>
         <w:t>Nivå 1</w:t>
       </w:r>
       <w:r>
@@ -4221,7 +4312,7 @@
         <w:rFonts w:ascii="Courier New" w:hAnsi="Courier New" w:cs="Courier New" w:hint="default"/>
       </w:rPr>
     </w:lvl>
-    <w:lvl w:ilvl="2" w:tplc="041D0005" w:tentative="1">
+    <w:lvl w:ilvl="2" w:tplc="041D0005">
       <w:start w:val="1"/>
       <w:numFmt w:val="bullet"/>
       <w:lvlText w:val=""/>

</xml_diff>

<commit_message>
feat: enhance EditPersonModal with right-click context menu for event management and update App component for improved editor behavior
</commit_message>
<xml_diff>
--- a/docs/släktträd.docx
+++ b/docs/släktträd.docx
@@ -40,8 +40,44 @@
         <w:rPr>
           <w:lang w:val="en-US"/>
         </w:rPr>
-        <w:t>React/Electron → (HTTP-anrop, t.ex. fetch) → Flask (Python) → (SQL) → SQLite-databas</w:t>
-      </w:r>
+        <w:t>React/Electron → (HTTP-</w:t>
+      </w:r>
+      <w:proofErr w:type="spellStart"/>
+      <w:r>
+        <w:rPr>
+          <w:lang w:val="en-US"/>
+        </w:rPr>
+        <w:t>anrop</w:t>
+      </w:r>
+      <w:proofErr w:type="spellEnd"/>
+      <w:r>
+        <w:rPr>
+          <w:lang w:val="en-US"/>
+        </w:rPr>
+        <w:t xml:space="preserve">, </w:t>
+      </w:r>
+      <w:proofErr w:type="spellStart"/>
+      <w:r>
+        <w:rPr>
+          <w:lang w:val="en-US"/>
+        </w:rPr>
+        <w:t>t.ex</w:t>
+      </w:r>
+      <w:proofErr w:type="spellEnd"/>
+      <w:r>
+        <w:rPr>
+          <w:lang w:val="en-US"/>
+        </w:rPr>
+        <w:t>. fetch) → Flask (Python) → (SQL) → SQLite-</w:t>
+      </w:r>
+      <w:proofErr w:type="spellStart"/>
+      <w:r>
+        <w:rPr>
+          <w:lang w:val="en-US"/>
+        </w:rPr>
+        <w:t>databas</w:t>
+      </w:r>
+      <w:proofErr w:type="spellEnd"/>
     </w:p>
     <w:p>
       <w:pPr>
@@ -67,19 +103,33 @@
         <w:rPr>
           <w:lang w:val="en-US"/>
         </w:rPr>
-        <w:t>C:\Users\denni\Documents\Dennis\programmering\WestFamilyTree\WestFamilyTree&gt; npm run dev</w:t>
-      </w:r>
-    </w:p>
-    <w:p>
-      <w:pPr>
+        <w:t xml:space="preserve">C:\Users\denni\Documents\Dennis\programmering\WestFamilyTree\WestFamilyTree&gt; </w:t>
+      </w:r>
+      <w:proofErr w:type="spellStart"/>
+      <w:r>
         <w:rPr>
           <w:lang w:val="en-US"/>
         </w:rPr>
-      </w:pPr>
+        <w:t>npm</w:t>
+      </w:r>
+      <w:proofErr w:type="spellEnd"/>
       <w:r>
         <w:rPr>
           <w:lang w:val="en-US"/>
         </w:rPr>
+        <w:t xml:space="preserve"> run dev</w:t>
+      </w:r>
+    </w:p>
+    <w:p>
+      <w:pPr>
+        <w:rPr>
+          <w:lang w:val="en-US"/>
+        </w:rPr>
+      </w:pPr>
+      <w:r>
+        <w:rPr>
+          <w:lang w:val="en-US"/>
+        </w:rPr>
         <w:t xml:space="preserve">C:\Users\denni\Documents\Dennis\programmering\WestFamilyTree\WestFamilyTree&gt; </w:t>
       </w:r>
       <w:r>
@@ -120,11 +170,19 @@
         </w:rPr>
         <w:t xml:space="preserve">C:\Users\denni\Documents\Dennis\programmering\WestFamilyTree\WestFamilyTree&gt; </w:t>
       </w:r>
+      <w:proofErr w:type="spellStart"/>
       <w:r>
         <w:rPr>
           <w:lang w:val="en-US"/>
         </w:rPr>
-        <w:t>npm run electron</w:t>
+        <w:t>npm</w:t>
+      </w:r>
+      <w:proofErr w:type="spellEnd"/>
+      <w:r>
+        <w:rPr>
+          <w:lang w:val="en-US"/>
+        </w:rPr>
+        <w:t xml:space="preserve"> run electron</w:t>
       </w:r>
     </w:p>
     <w:p>
@@ -1259,6 +1317,9 @@
         </w:rPr>
       </w:pPr>
       <w:r>
+        <w:rPr>
+          <w:strike/>
+        </w:rPr>
         <w:t>När man trycker högerknappen på en livshändelse så ska där komma menyval som:</w:t>
       </w:r>
     </w:p>
@@ -1274,6 +1335,9 @@
         </w:rPr>
       </w:pPr>
       <w:r>
+        <w:rPr>
+          <w:strike/>
+        </w:rPr>
         <w:t>Kopiera källa</w:t>
       </w:r>
     </w:p>
@@ -1289,6 +1353,9 @@
         </w:rPr>
       </w:pPr>
       <w:r>
+        <w:rPr>
+          <w:strike/>
+        </w:rPr>
         <w:t>Klista in källa</w:t>
       </w:r>
     </w:p>
@@ -1304,6 +1371,9 @@
         </w:rPr>
       </w:pPr>
       <w:r>
+        <w:rPr>
+          <w:strike/>
+        </w:rPr>
         <w:lastRenderedPageBreak/>
         <w:t>Radera händelse</w:t>
       </w:r>
@@ -1320,6 +1390,9 @@
         </w:rPr>
       </w:pPr>
       <w:r>
+        <w:rPr>
+          <w:strike/>
+        </w:rPr>
         <w:t>Redigera händelse</w:t>
       </w:r>
     </w:p>
@@ -1335,6 +1408,9 @@
         </w:rPr>
       </w:pPr>
       <w:r>
+        <w:rPr>
+          <w:strike/>
+        </w:rPr>
         <w:t>Byt händelse</w:t>
       </w:r>
     </w:p>
@@ -1480,11 +1556,19 @@
           <w:lang w:val="en-US"/>
         </w:rPr>
       </w:pPr>
+      <w:proofErr w:type="spellStart"/>
       <w:r>
         <w:rPr>
           <w:lang w:val="en-US"/>
         </w:rPr>
-        <w:t>Profilbilds-skördare (Crop-to-Profile):</w:t>
+        <w:t>Profilbilds-skördare</w:t>
+      </w:r>
+      <w:proofErr w:type="spellEnd"/>
+      <w:r>
+        <w:rPr>
+          <w:lang w:val="en-US"/>
+        </w:rPr>
+        <w:t xml:space="preserve"> (Crop-to-Profile):</w:t>
       </w:r>
     </w:p>
     <w:p>
@@ -2805,12 +2889,14 @@
           <w:lang w:val="en-US"/>
         </w:rPr>
       </w:pPr>
+      <w:proofErr w:type="spellStart"/>
       <w:r>
         <w:rPr>
           <w:lang w:val="en-US"/>
         </w:rPr>
         <w:t>Formatet</w:t>
       </w:r>
+      <w:proofErr w:type="spellEnd"/>
     </w:p>
     <w:p>
       <w:pPr>
@@ -2818,11 +2904,19 @@
           <w:lang w:val="en-US"/>
         </w:rPr>
       </w:pPr>
+      <w:proofErr w:type="spellStart"/>
       <w:r>
         <w:rPr>
           <w:lang w:val="en-US"/>
         </w:rPr>
-        <w:t>Stad (City/Township), County, Stat, Land</w:t>
+        <w:t>Stad</w:t>
+      </w:r>
+      <w:proofErr w:type="spellEnd"/>
+      <w:r>
+        <w:rPr>
+          <w:lang w:val="en-US"/>
+        </w:rPr>
+        <w:t xml:space="preserve"> (City/Township), County, Stat, Land</w:t>
       </w:r>
     </w:p>
     <w:p>
@@ -2897,7 +2991,20 @@
           <w:lang w:val="en-US"/>
         </w:rPr>
         <w:tab/>
-        <w:t>Landsbygd: Chisago Lake Twp, Chisago, MN, USA</w:t>
+      </w:r>
+      <w:proofErr w:type="spellStart"/>
+      <w:r>
+        <w:rPr>
+          <w:lang w:val="en-US"/>
+        </w:rPr>
+        <w:t>Landsbygd</w:t>
+      </w:r>
+      <w:proofErr w:type="spellEnd"/>
+      <w:r>
+        <w:rPr>
+          <w:lang w:val="en-US"/>
+        </w:rPr>
+        <w:t>: Chisago Lake Twp, Chisago, MN, USA</w:t>
       </w:r>
     </w:p>
     <w:p>
@@ -2946,7 +3053,49 @@
           <w:lang w:val="en-US"/>
         </w:rPr>
         <w:tab/>
-        <w:t>const parts = placString.split(',').map(p =&gt; p.trim());</w:t>
+        <w:t xml:space="preserve">const parts = </w:t>
+      </w:r>
+      <w:proofErr w:type="spellStart"/>
+      <w:r>
+        <w:rPr>
+          <w:lang w:val="en-US"/>
+        </w:rPr>
+        <w:t>placString.split</w:t>
+      </w:r>
+      <w:proofErr w:type="spellEnd"/>
+      <w:r>
+        <w:rPr>
+          <w:lang w:val="en-US"/>
+        </w:rPr>
+        <w:t>(','</w:t>
+      </w:r>
+      <w:proofErr w:type="gramStart"/>
+      <w:r>
+        <w:rPr>
+          <w:lang w:val="en-US"/>
+        </w:rPr>
+        <w:t>).map</w:t>
+      </w:r>
+      <w:proofErr w:type="gramEnd"/>
+      <w:r>
+        <w:rPr>
+          <w:lang w:val="en-US"/>
+        </w:rPr>
+        <w:t xml:space="preserve">(p =&gt; </w:t>
+      </w:r>
+      <w:proofErr w:type="spellStart"/>
+      <w:r>
+        <w:rPr>
+          <w:lang w:val="en-US"/>
+        </w:rPr>
+        <w:t>p.trim</w:t>
+      </w:r>
+      <w:proofErr w:type="spellEnd"/>
+      <w:r>
+        <w:rPr>
+          <w:lang w:val="en-US"/>
+        </w:rPr>
+        <w:t>());</w:t>
       </w:r>
     </w:p>
     <w:p>

</xml_diff>

<commit_message>
feat: add text context menu functionality and enhance App component for better user interaction
</commit_message>
<xml_diff>
--- a/docs/släktträd.docx
+++ b/docs/släktträd.docx
@@ -40,57 +40,53 @@
         <w:rPr>
           <w:lang w:val="en-US"/>
         </w:rPr>
-        <w:t>React/Electron → (HTTP-</w:t>
-      </w:r>
-      <w:proofErr w:type="spellStart"/>
-      <w:r>
+        <w:t>React/Electron → (HTTP-anrop, t.ex. fetch) → Flask (Python) → (SQL) → SQLite-databas</w:t>
+      </w:r>
+    </w:p>
+    <w:p>
+      <w:pPr>
+        <w:pStyle w:val="Heading1"/>
         <w:rPr>
           <w:lang w:val="en-US"/>
         </w:rPr>
-        <w:t>anrop</w:t>
-      </w:r>
-      <w:proofErr w:type="spellEnd"/>
+      </w:pPr>
       <w:r>
         <w:rPr>
           <w:lang w:val="en-US"/>
         </w:rPr>
-        <w:t xml:space="preserve">, </w:t>
-      </w:r>
-      <w:proofErr w:type="spellStart"/>
-      <w:r>
+        <w:t>STARTA SERVER &amp; ELECTRON</w:t>
+      </w:r>
+    </w:p>
+    <w:p>
+      <w:pPr>
         <w:rPr>
           <w:lang w:val="en-US"/>
         </w:rPr>
-        <w:t>t.ex</w:t>
-      </w:r>
-      <w:proofErr w:type="spellEnd"/>
+      </w:pPr>
       <w:r>
         <w:rPr>
           <w:lang w:val="en-US"/>
         </w:rPr>
-        <w:t>. fetch) → Flask (Python) → (SQL) → SQLite-</w:t>
-      </w:r>
-      <w:proofErr w:type="spellStart"/>
-      <w:r>
+        <w:t>C:\Users\denni\Documents\Dennis\programmering\WestFamilyTree\WestFamilyTree&gt; npm run dev</w:t>
+      </w:r>
+    </w:p>
+    <w:p>
+      <w:pPr>
         <w:rPr>
           <w:lang w:val="en-US"/>
         </w:rPr>
-        <w:t>databas</w:t>
-      </w:r>
-      <w:proofErr w:type="spellEnd"/>
-    </w:p>
-    <w:p>
-      <w:pPr>
-        <w:pStyle w:val="Heading1"/>
+      </w:pPr>
+      <w:r>
         <w:rPr>
           <w:lang w:val="en-US"/>
         </w:rPr>
-      </w:pPr>
+        <w:t xml:space="preserve">C:\Users\denni\Documents\Dennis\programmering\WestFamilyTree\WestFamilyTree&gt; </w:t>
+      </w:r>
       <w:r>
         <w:rPr>
           <w:lang w:val="en-US"/>
         </w:rPr>
-        <w:t>STARTA SERVER &amp; ELECTRON</w:t>
+        <w:t>python api_server_cors.py</w:t>
       </w:r>
     </w:p>
     <w:p>
@@ -105,84 +101,30 @@
         </w:rPr>
         <w:t xml:space="preserve">C:\Users\denni\Documents\Dennis\programmering\WestFamilyTree\WestFamilyTree&gt; </w:t>
       </w:r>
-      <w:proofErr w:type="spellStart"/>
       <w:r>
         <w:rPr>
           <w:lang w:val="en-US"/>
         </w:rPr>
-        <w:t>npm</w:t>
-      </w:r>
-      <w:proofErr w:type="spellEnd"/>
-      <w:r>
+        <w:t>python oai_proxy.py</w:t>
+      </w:r>
+    </w:p>
+    <w:p>
+      <w:pPr>
         <w:rPr>
           <w:lang w:val="en-US"/>
         </w:rPr>
-        <w:t xml:space="preserve"> run dev</w:t>
-      </w:r>
-    </w:p>
-    <w:p>
-      <w:pPr>
+      </w:pPr>
+      <w:r>
         <w:rPr>
           <w:lang w:val="en-US"/>
         </w:rPr>
-      </w:pPr>
+        <w:t xml:space="preserve">C:\Users\denni\Documents\Dennis\programmering\WestFamilyTree\WestFamilyTree&gt; </w:t>
+      </w:r>
       <w:r>
         <w:rPr>
           <w:lang w:val="en-US"/>
         </w:rPr>
-        <w:t xml:space="preserve">C:\Users\denni\Documents\Dennis\programmering\WestFamilyTree\WestFamilyTree&gt; </w:t>
-      </w:r>
-      <w:r>
-        <w:rPr>
-          <w:lang w:val="en-US"/>
-        </w:rPr>
-        <w:t>python api_server_cors.py</w:t>
-      </w:r>
-    </w:p>
-    <w:p>
-      <w:pPr>
-        <w:rPr>
-          <w:lang w:val="en-US"/>
-        </w:rPr>
-      </w:pPr>
-      <w:r>
-        <w:rPr>
-          <w:lang w:val="en-US"/>
-        </w:rPr>
-        <w:t xml:space="preserve">C:\Users\denni\Documents\Dennis\programmering\WestFamilyTree\WestFamilyTree&gt; </w:t>
-      </w:r>
-      <w:r>
-        <w:rPr>
-          <w:lang w:val="en-US"/>
-        </w:rPr>
-        <w:t>python oai_proxy.py</w:t>
-      </w:r>
-    </w:p>
-    <w:p>
-      <w:pPr>
-        <w:rPr>
-          <w:lang w:val="en-US"/>
-        </w:rPr>
-      </w:pPr>
-      <w:r>
-        <w:rPr>
-          <w:lang w:val="en-US"/>
-        </w:rPr>
-        <w:t xml:space="preserve">C:\Users\denni\Documents\Dennis\programmering\WestFamilyTree\WestFamilyTree&gt; </w:t>
-      </w:r>
-      <w:proofErr w:type="spellStart"/>
-      <w:r>
-        <w:rPr>
-          <w:lang w:val="en-US"/>
-        </w:rPr>
-        <w:t>npm</w:t>
-      </w:r>
-      <w:proofErr w:type="spellEnd"/>
-      <w:r>
-        <w:rPr>
-          <w:lang w:val="en-US"/>
-        </w:rPr>
-        <w:t xml:space="preserve"> run electron</w:t>
+        <w:t>npm run electron</w:t>
       </w:r>
     </w:p>
     <w:p>
@@ -1556,19 +1498,11 @@
           <w:lang w:val="en-US"/>
         </w:rPr>
       </w:pPr>
-      <w:proofErr w:type="spellStart"/>
       <w:r>
         <w:rPr>
           <w:lang w:val="en-US"/>
         </w:rPr>
-        <w:t>Profilbilds-skördare</w:t>
-      </w:r>
-      <w:proofErr w:type="spellEnd"/>
-      <w:r>
-        <w:rPr>
-          <w:lang w:val="en-US"/>
-        </w:rPr>
-        <w:t xml:space="preserve"> (Crop-to-Profile):</w:t>
+        <w:t>Profilbilds-skördare (Crop-to-Profile):</w:t>
       </w:r>
     </w:p>
     <w:p>
@@ -2499,11 +2433,77 @@
         <w:t>Tangentbordsgenvägar: N för Ny person, S för Spara, Ctrl+F för Sök. Gör det blixtsnabbt att jobba.</w:t>
       </w:r>
     </w:p>
-    <w:p/>
-    <w:p>
-      <w:pPr>
-        <w:pStyle w:val="Heading1"/>
-      </w:pPr>
+    <w:p>
+      <w:pPr>
+        <w:pStyle w:val="ListParagraph"/>
+        <w:numPr>
+          <w:ilvl w:val="0"/>
+          <w:numId w:val="9"/>
+        </w:numPr>
+      </w:pPr>
+      <w:r>
+        <w:t>Visa i livshändelser i editpersonmodal on/off toggle:</w:t>
+      </w:r>
+    </w:p>
+    <w:p>
+      <w:pPr>
+        <w:pStyle w:val="ListParagraph"/>
+        <w:numPr>
+          <w:ilvl w:val="1"/>
+          <w:numId w:val="9"/>
+        </w:numPr>
+      </w:pPr>
+      <w:r>
+        <w:t>Barn födda/döda</w:t>
+      </w:r>
+    </w:p>
+    <w:p>
+      <w:pPr>
+        <w:pStyle w:val="ListParagraph"/>
+        <w:numPr>
+          <w:ilvl w:val="1"/>
+          <w:numId w:val="9"/>
+        </w:numPr>
+      </w:pPr>
+      <w:r>
+        <w:t xml:space="preserve">Syskon </w:t>
+      </w:r>
+      <w:r>
+        <w:t>födda/döda</w:t>
+      </w:r>
+    </w:p>
+    <w:p>
+      <w:pPr>
+        <w:pStyle w:val="ListParagraph"/>
+        <w:numPr>
+          <w:ilvl w:val="1"/>
+          <w:numId w:val="9"/>
+        </w:numPr>
+      </w:pPr>
+      <w:r>
+        <w:t xml:space="preserve">Föräldrar </w:t>
+      </w:r>
+      <w:r>
+        <w:t>födda/döda</w:t>
+      </w:r>
+    </w:p>
+    <w:p>
+      <w:pPr>
+        <w:pStyle w:val="ListParagraph"/>
+        <w:numPr>
+          <w:ilvl w:val="1"/>
+          <w:numId w:val="9"/>
+        </w:numPr>
+      </w:pPr>
+      <w:r>
+        <w:t xml:space="preserve">Partners </w:t>
+      </w:r>
+      <w:r>
+        <w:t>födda/död</w:t>
+      </w:r>
+      <w:r>
+        <w:t>a</w:t>
+      </w:r>
     </w:p>
     <w:p>
       <w:pPr>
@@ -2889,14 +2889,12 @@
           <w:lang w:val="en-US"/>
         </w:rPr>
       </w:pPr>
-      <w:proofErr w:type="spellStart"/>
       <w:r>
         <w:rPr>
           <w:lang w:val="en-US"/>
         </w:rPr>
         <w:t>Formatet</w:t>
       </w:r>
-      <w:proofErr w:type="spellEnd"/>
     </w:p>
     <w:p>
       <w:pPr>
@@ -2904,19 +2902,11 @@
           <w:lang w:val="en-US"/>
         </w:rPr>
       </w:pPr>
-      <w:proofErr w:type="spellStart"/>
       <w:r>
         <w:rPr>
           <w:lang w:val="en-US"/>
         </w:rPr>
-        <w:t>Stad</w:t>
-      </w:r>
-      <w:proofErr w:type="spellEnd"/>
-      <w:r>
-        <w:rPr>
-          <w:lang w:val="en-US"/>
-        </w:rPr>
-        <w:t xml:space="preserve"> (City/Township), County, Stat, Land</w:t>
+        <w:t>Stad (City/Township), County, Stat, Land</w:t>
       </w:r>
     </w:p>
     <w:p>
@@ -2991,20 +2981,7 @@
           <w:lang w:val="en-US"/>
         </w:rPr>
         <w:tab/>
-      </w:r>
-      <w:proofErr w:type="spellStart"/>
-      <w:r>
-        <w:rPr>
-          <w:lang w:val="en-US"/>
-        </w:rPr>
-        <w:t>Landsbygd</w:t>
-      </w:r>
-      <w:proofErr w:type="spellEnd"/>
-      <w:r>
-        <w:rPr>
-          <w:lang w:val="en-US"/>
-        </w:rPr>
-        <w:t>: Chisago Lake Twp, Chisago, MN, USA</w:t>
+        <w:t>Landsbygd: Chisago Lake Twp, Chisago, MN, USA</w:t>
       </w:r>
     </w:p>
     <w:p>
@@ -3053,49 +3030,7 @@
           <w:lang w:val="en-US"/>
         </w:rPr>
         <w:tab/>
-        <w:t xml:space="preserve">const parts = </w:t>
-      </w:r>
-      <w:proofErr w:type="spellStart"/>
-      <w:r>
-        <w:rPr>
-          <w:lang w:val="en-US"/>
-        </w:rPr>
-        <w:t>placString.split</w:t>
-      </w:r>
-      <w:proofErr w:type="spellEnd"/>
-      <w:r>
-        <w:rPr>
-          <w:lang w:val="en-US"/>
-        </w:rPr>
-        <w:t>(','</w:t>
-      </w:r>
-      <w:proofErr w:type="gramStart"/>
-      <w:r>
-        <w:rPr>
-          <w:lang w:val="en-US"/>
-        </w:rPr>
-        <w:t>).map</w:t>
-      </w:r>
-      <w:proofErr w:type="gramEnd"/>
-      <w:r>
-        <w:rPr>
-          <w:lang w:val="en-US"/>
-        </w:rPr>
-        <w:t xml:space="preserve">(p =&gt; </w:t>
-      </w:r>
-      <w:proofErr w:type="spellStart"/>
-      <w:r>
-        <w:rPr>
-          <w:lang w:val="en-US"/>
-        </w:rPr>
-        <w:t>p.trim</w:t>
-      </w:r>
-      <w:proofErr w:type="spellEnd"/>
-      <w:r>
-        <w:rPr>
-          <w:lang w:val="en-US"/>
-        </w:rPr>
-        <w:t>());</w:t>
+        <w:t>const parts = placString.split(',').map(p =&gt; p.trim());</w:t>
       </w:r>
     </w:p>
     <w:p>
@@ -4336,7 +4271,7 @@
         <w:rFonts w:ascii="Symbol" w:hAnsi="Symbol" w:hint="default"/>
       </w:rPr>
     </w:lvl>
-    <w:lvl w:ilvl="1" w:tplc="041D0003" w:tentative="1">
+    <w:lvl w:ilvl="1" w:tplc="041D0003">
       <w:start w:val="1"/>
       <w:numFmt w:val="bullet"/>
       <w:lvlText w:val="o"/>

</xml_diff>

<commit_message>
feat(MediaSelector): enhance media management with sorting, selection, and download features
- Added sorting functionality for media items (by name and date).
- Implemented multi-selection of media items with checkboxes.
- Introduced download options for selected media, including zip downloads.
- Enhanced UI for media upload and drag-and-drop support.
- Improved context menu options for media actions.
- Added functionality to delete selected media items.
- Updated media display to reflect sorting and selection states.
- Introduced new media file (20260406-150957.png) for testing purposes.
</commit_message>
<xml_diff>
--- a/docs/släktträd.docx
+++ b/docs/släktträd.docx
@@ -40,8 +40,44 @@
         <w:rPr>
           <w:lang w:val="en-US"/>
         </w:rPr>
-        <w:t>React/Electron → (HTTP-anrop, t.ex. fetch) → Flask (Python) → (SQL) → SQLite-databas</w:t>
-      </w:r>
+        <w:t>React/Electron → (HTTP-</w:t>
+      </w:r>
+      <w:proofErr w:type="spellStart"/>
+      <w:r>
+        <w:rPr>
+          <w:lang w:val="en-US"/>
+        </w:rPr>
+        <w:t>anrop</w:t>
+      </w:r>
+      <w:proofErr w:type="spellEnd"/>
+      <w:r>
+        <w:rPr>
+          <w:lang w:val="en-US"/>
+        </w:rPr>
+        <w:t xml:space="preserve">, </w:t>
+      </w:r>
+      <w:proofErr w:type="spellStart"/>
+      <w:r>
+        <w:rPr>
+          <w:lang w:val="en-US"/>
+        </w:rPr>
+        <w:t>t.ex</w:t>
+      </w:r>
+      <w:proofErr w:type="spellEnd"/>
+      <w:r>
+        <w:rPr>
+          <w:lang w:val="en-US"/>
+        </w:rPr>
+        <w:t>. fetch) → Flask (Python) → (SQL) → SQLite-</w:t>
+      </w:r>
+      <w:proofErr w:type="spellStart"/>
+      <w:r>
+        <w:rPr>
+          <w:lang w:val="en-US"/>
+        </w:rPr>
+        <w:t>databas</w:t>
+      </w:r>
+      <w:proofErr w:type="spellEnd"/>
     </w:p>
     <w:p>
       <w:pPr>
@@ -67,19 +103,33 @@
         <w:rPr>
           <w:lang w:val="en-US"/>
         </w:rPr>
-        <w:t>C:\Users\denni\Documents\Dennis\programmering\WestFamilyTree\WestFamilyTree&gt; npm run dev</w:t>
-      </w:r>
-    </w:p>
-    <w:p>
-      <w:pPr>
+        <w:t xml:space="preserve">C:\Users\denni\Documents\Dennis\programmering\WestFamilyTree\WestFamilyTree&gt; </w:t>
+      </w:r>
+      <w:proofErr w:type="spellStart"/>
+      <w:r>
         <w:rPr>
           <w:lang w:val="en-US"/>
         </w:rPr>
-      </w:pPr>
+        <w:t>npm</w:t>
+      </w:r>
+      <w:proofErr w:type="spellEnd"/>
       <w:r>
         <w:rPr>
           <w:lang w:val="en-US"/>
         </w:rPr>
+        <w:t xml:space="preserve"> run dev</w:t>
+      </w:r>
+    </w:p>
+    <w:p>
+      <w:pPr>
+        <w:rPr>
+          <w:lang w:val="en-US"/>
+        </w:rPr>
+      </w:pPr>
+      <w:r>
+        <w:rPr>
+          <w:lang w:val="en-US"/>
+        </w:rPr>
         <w:t xml:space="preserve">C:\Users\denni\Documents\Dennis\programmering\WestFamilyTree\WestFamilyTree&gt; </w:t>
       </w:r>
       <w:r>
@@ -120,11 +170,19 @@
         </w:rPr>
         <w:t xml:space="preserve">C:\Users\denni\Documents\Dennis\programmering\WestFamilyTree\WestFamilyTree&gt; </w:t>
       </w:r>
+      <w:proofErr w:type="spellStart"/>
       <w:r>
         <w:rPr>
           <w:lang w:val="en-US"/>
         </w:rPr>
-        <w:t>npm run electron</w:t>
+        <w:t>npm</w:t>
+      </w:r>
+      <w:proofErr w:type="spellEnd"/>
+      <w:r>
+        <w:rPr>
+          <w:lang w:val="en-US"/>
+        </w:rPr>
+        <w:t xml:space="preserve"> run electron</w:t>
       </w:r>
     </w:p>
     <w:p>
@@ -1498,11 +1556,19 @@
           <w:lang w:val="en-US"/>
         </w:rPr>
       </w:pPr>
+      <w:proofErr w:type="spellStart"/>
       <w:r>
         <w:rPr>
           <w:lang w:val="en-US"/>
         </w:rPr>
-        <w:t>Profilbilds-skördare (Crop-to-Profile):</w:t>
+        <w:t>Profilbilds-skördare</w:t>
+      </w:r>
+      <w:proofErr w:type="spellEnd"/>
+      <w:r>
+        <w:rPr>
+          <w:lang w:val="en-US"/>
+        </w:rPr>
+        <w:t xml:space="preserve"> (Crop-to-Profile):</w:t>
       </w:r>
     </w:p>
     <w:p>
@@ -2507,6 +2573,142 @@
     </w:p>
     <w:p>
       <w:pPr>
+        <w:pStyle w:val="Heading2"/>
+      </w:pPr>
+      <w:r>
+        <w:t>Hjälp</w:t>
+      </w:r>
+    </w:p>
+    <w:p>
+      <w:pPr>
+        <w:pStyle w:val="Heading3"/>
+      </w:pPr>
+      <w:r>
+        <w:t>Kortkommandon:</w:t>
+      </w:r>
+    </w:p>
+    <w:p>
+      <w:pPr>
+        <w:pStyle w:val="ListParagraph"/>
+        <w:numPr>
+          <w:ilvl w:val="0"/>
+          <w:numId w:val="19"/>
+        </w:numPr>
+      </w:pPr>
+      <w:r>
+        <w:t>Tab/Enter = hoppa mellan rutorna</w:t>
+      </w:r>
+    </w:p>
+    <w:p>
+      <w:pPr>
+        <w:pStyle w:val="ListParagraph"/>
+        <w:numPr>
+          <w:ilvl w:val="0"/>
+          <w:numId w:val="19"/>
+        </w:numPr>
+      </w:pPr>
+      <w:r>
+        <w:t>Shift+Enter = Stäng modal och bekräfta ändringar.</w:t>
+      </w:r>
+    </w:p>
+    <w:p>
+      <w:pPr>
+        <w:pStyle w:val="ListParagraph"/>
+        <w:numPr>
+          <w:ilvl w:val="0"/>
+          <w:numId w:val="19"/>
+        </w:numPr>
+      </w:pPr>
+      <w:r>
+        <w:t>Esc = Avbryt och stäng modal. Bekräftelse först!</w:t>
+      </w:r>
+    </w:p>
+    <w:p>
+      <w:pPr>
+        <w:pStyle w:val="ListParagraph"/>
+        <w:numPr>
+          <w:ilvl w:val="0"/>
+          <w:numId w:val="19"/>
+        </w:numPr>
+      </w:pPr>
+      <w:r>
+        <w:t>+/- = Förstora bild/förminska bilder</w:t>
+      </w:r>
+      <w:r>
+        <w:t xml:space="preserve"> </w:t>
+      </w:r>
+      <w:r>
+        <w:t>/släktträd</w:t>
+      </w:r>
+    </w:p>
+    <w:p>
+      <w:pPr>
+        <w:pStyle w:val="ListParagraph"/>
+        <w:numPr>
+          <w:ilvl w:val="0"/>
+          <w:numId w:val="19"/>
+        </w:numPr>
+      </w:pPr>
+      <w:r>
+        <w:t>Piltangenterna = Förflytta sig i släktträdet</w:t>
+      </w:r>
+    </w:p>
+    <w:p>
+      <w:pPr>
+        <w:pStyle w:val="ListParagraph"/>
+        <w:numPr>
+          <w:ilvl w:val="0"/>
+          <w:numId w:val="19"/>
+        </w:numPr>
+      </w:pPr>
+      <w:r>
+        <w:t>CTRL+F</w:t>
+      </w:r>
+      <w:r>
+        <w:t>= Sök i släktträdet eller personregistret</w:t>
+      </w:r>
+    </w:p>
+    <w:p>
+      <w:pPr>
+        <w:pStyle w:val="ListParagraph"/>
+        <w:numPr>
+          <w:ilvl w:val="0"/>
+          <w:numId w:val="19"/>
+        </w:numPr>
+      </w:pPr>
+      <w:r>
+        <w:t>CTRL+S= Spara db</w:t>
+      </w:r>
+    </w:p>
+    <w:p>
+      <w:pPr>
+        <w:pStyle w:val="ListParagraph"/>
+        <w:numPr>
+          <w:ilvl w:val="0"/>
+          <w:numId w:val="19"/>
+        </w:numPr>
+      </w:pPr>
+      <w:r>
+        <w:t>CTRL+</w:t>
+      </w:r>
+      <w:r>
+        <w:t>N= Ny person (i personregistret), Ny källa i källkatlog-fliken,ny plats i plats-registret.</w:t>
+      </w:r>
+    </w:p>
+    <w:p>
+      <w:pPr>
+        <w:pStyle w:val="ListParagraph"/>
+        <w:numPr>
+          <w:ilvl w:val="0"/>
+          <w:numId w:val="19"/>
+        </w:numPr>
+      </w:pPr>
+      <w:r>
+        <w:t>Del = I mediafliken på vald bild så ska den raderas, bekräftelse först, sen undotoast.</w:t>
+      </w:r>
+    </w:p>
+    <w:p>
+      <w:pPr>
         <w:pStyle w:val="Heading1"/>
       </w:pPr>
       <w:r>
@@ -2644,6 +2846,7 @@
     </w:p>
     <w:p>
       <w:r>
+        <w:lastRenderedPageBreak/>
         <w:t xml:space="preserve">  -I redigera Arkiv Digital källa: Knappen i fältet för AID ska heta AID och inte AD.</w:t>
       </w:r>
     </w:p>
@@ -2667,7 +2870,6 @@
         <w:pStyle w:val="Heading1"/>
       </w:pPr>
       <w:r>
-        <w:lastRenderedPageBreak/>
         <w:t xml:space="preserve">FEL </w:t>
       </w:r>
       <w:r>
@@ -2810,6 +3012,7 @@
     </w:p>
     <w:p>
       <w:r>
+        <w:lastRenderedPageBreak/>
         <w:t>1.</w:t>
       </w:r>
       <w:r>
@@ -2860,7 +3063,6 @@
     </w:p>
     <w:p>
       <w:r>
-        <w:lastRenderedPageBreak/>
         <w:t>•</w:t>
       </w:r>
       <w:r>
@@ -2889,12 +3091,14 @@
           <w:lang w:val="en-US"/>
         </w:rPr>
       </w:pPr>
+      <w:proofErr w:type="spellStart"/>
       <w:r>
         <w:rPr>
           <w:lang w:val="en-US"/>
         </w:rPr>
         <w:t>Formatet</w:t>
       </w:r>
+      <w:proofErr w:type="spellEnd"/>
     </w:p>
     <w:p>
       <w:pPr>
@@ -2902,11 +3106,19 @@
           <w:lang w:val="en-US"/>
         </w:rPr>
       </w:pPr>
+      <w:proofErr w:type="spellStart"/>
       <w:r>
         <w:rPr>
           <w:lang w:val="en-US"/>
         </w:rPr>
-        <w:t>Stad (City/Township), County, Stat, Land</w:t>
+        <w:t>Stad</w:t>
+      </w:r>
+      <w:proofErr w:type="spellEnd"/>
+      <w:r>
+        <w:rPr>
+          <w:lang w:val="en-US"/>
+        </w:rPr>
+        <w:t xml:space="preserve"> (City/Township), County, Stat, Land</w:t>
       </w:r>
     </w:p>
     <w:p>
@@ -2981,7 +3193,20 @@
           <w:lang w:val="en-US"/>
         </w:rPr>
         <w:tab/>
-        <w:t>Landsbygd: Chisago Lake Twp, Chisago, MN, USA</w:t>
+      </w:r>
+      <w:proofErr w:type="spellStart"/>
+      <w:r>
+        <w:rPr>
+          <w:lang w:val="en-US"/>
+        </w:rPr>
+        <w:t>Landsbygd</w:t>
+      </w:r>
+      <w:proofErr w:type="spellEnd"/>
+      <w:r>
+        <w:rPr>
+          <w:lang w:val="en-US"/>
+        </w:rPr>
+        <w:t>: Chisago Lake Twp, Chisago, MN, USA</w:t>
       </w:r>
     </w:p>
     <w:p>
@@ -3030,7 +3255,49 @@
           <w:lang w:val="en-US"/>
         </w:rPr>
         <w:tab/>
-        <w:t>const parts = placString.split(',').map(p =&gt; p.trim());</w:t>
+        <w:t xml:space="preserve">const parts = </w:t>
+      </w:r>
+      <w:proofErr w:type="spellStart"/>
+      <w:r>
+        <w:rPr>
+          <w:lang w:val="en-US"/>
+        </w:rPr>
+        <w:t>placString.split</w:t>
+      </w:r>
+      <w:proofErr w:type="spellEnd"/>
+      <w:r>
+        <w:rPr>
+          <w:lang w:val="en-US"/>
+        </w:rPr>
+        <w:t>(','</w:t>
+      </w:r>
+      <w:proofErr w:type="gramStart"/>
+      <w:r>
+        <w:rPr>
+          <w:lang w:val="en-US"/>
+        </w:rPr>
+        <w:t>).map</w:t>
+      </w:r>
+      <w:proofErr w:type="gramEnd"/>
+      <w:r>
+        <w:rPr>
+          <w:lang w:val="en-US"/>
+        </w:rPr>
+        <w:t xml:space="preserve">(p =&gt; </w:t>
+      </w:r>
+      <w:proofErr w:type="spellStart"/>
+      <w:r>
+        <w:rPr>
+          <w:lang w:val="en-US"/>
+        </w:rPr>
+        <w:t>p.trim</w:t>
+      </w:r>
+      <w:proofErr w:type="spellEnd"/>
+      <w:r>
+        <w:rPr>
+          <w:lang w:val="en-US"/>
+        </w:rPr>
+        <w:t>());</w:t>
       </w:r>
     </w:p>
     <w:p>
@@ -3053,6 +3320,7 @@
     </w:p>
     <w:p>
       <w:r>
+        <w:lastRenderedPageBreak/>
         <w:t>o</w:t>
       </w:r>
       <w:r>
@@ -3103,7 +3371,6 @@
     </w:p>
     <w:p>
       <w:r>
-        <w:lastRenderedPageBreak/>
         <w:t>•</w:t>
       </w:r>
       <w:r>
@@ -5266,6 +5533,119 @@
       <w:lvlJc w:val="left"/>
       <w:pPr>
         <w:ind w:left="7784" w:hanging="360"/>
+      </w:pPr>
+      <w:rPr>
+        <w:rFonts w:ascii="Wingdings" w:hAnsi="Wingdings" w:hint="default"/>
+      </w:rPr>
+    </w:lvl>
+  </w:abstractNum>
+  <w:abstractNum w:abstractNumId="18" w15:restartNumberingAfterBreak="0">
+    <w:nsid w:val="792421DB"/>
+    <w:multiLevelType w:val="hybridMultilevel"/>
+    <w:tmpl w:val="EC94815E"/>
+    <w:lvl w:ilvl="0" w:tplc="041D0001">
+      <w:start w:val="1"/>
+      <w:numFmt w:val="bullet"/>
+      <w:lvlText w:val=""/>
+      <w:lvlJc w:val="left"/>
+      <w:pPr>
+        <w:ind w:left="720" w:hanging="360"/>
+      </w:pPr>
+      <w:rPr>
+        <w:rFonts w:ascii="Symbol" w:hAnsi="Symbol" w:hint="default"/>
+      </w:rPr>
+    </w:lvl>
+    <w:lvl w:ilvl="1" w:tplc="041D0003" w:tentative="1">
+      <w:start w:val="1"/>
+      <w:numFmt w:val="bullet"/>
+      <w:lvlText w:val="o"/>
+      <w:lvlJc w:val="left"/>
+      <w:pPr>
+        <w:ind w:left="1440" w:hanging="360"/>
+      </w:pPr>
+      <w:rPr>
+        <w:rFonts w:ascii="Courier New" w:hAnsi="Courier New" w:cs="Courier New" w:hint="default"/>
+      </w:rPr>
+    </w:lvl>
+    <w:lvl w:ilvl="2" w:tplc="041D0005" w:tentative="1">
+      <w:start w:val="1"/>
+      <w:numFmt w:val="bullet"/>
+      <w:lvlText w:val=""/>
+      <w:lvlJc w:val="left"/>
+      <w:pPr>
+        <w:ind w:left="2160" w:hanging="360"/>
+      </w:pPr>
+      <w:rPr>
+        <w:rFonts w:ascii="Wingdings" w:hAnsi="Wingdings" w:hint="default"/>
+      </w:rPr>
+    </w:lvl>
+    <w:lvl w:ilvl="3" w:tplc="041D0001" w:tentative="1">
+      <w:start w:val="1"/>
+      <w:numFmt w:val="bullet"/>
+      <w:lvlText w:val=""/>
+      <w:lvlJc w:val="left"/>
+      <w:pPr>
+        <w:ind w:left="2880" w:hanging="360"/>
+      </w:pPr>
+      <w:rPr>
+        <w:rFonts w:ascii="Symbol" w:hAnsi="Symbol" w:hint="default"/>
+      </w:rPr>
+    </w:lvl>
+    <w:lvl w:ilvl="4" w:tplc="041D0003" w:tentative="1">
+      <w:start w:val="1"/>
+      <w:numFmt w:val="bullet"/>
+      <w:lvlText w:val="o"/>
+      <w:lvlJc w:val="left"/>
+      <w:pPr>
+        <w:ind w:left="3600" w:hanging="360"/>
+      </w:pPr>
+      <w:rPr>
+        <w:rFonts w:ascii="Courier New" w:hAnsi="Courier New" w:cs="Courier New" w:hint="default"/>
+      </w:rPr>
+    </w:lvl>
+    <w:lvl w:ilvl="5" w:tplc="041D0005" w:tentative="1">
+      <w:start w:val="1"/>
+      <w:numFmt w:val="bullet"/>
+      <w:lvlText w:val=""/>
+      <w:lvlJc w:val="left"/>
+      <w:pPr>
+        <w:ind w:left="4320" w:hanging="360"/>
+      </w:pPr>
+      <w:rPr>
+        <w:rFonts w:ascii="Wingdings" w:hAnsi="Wingdings" w:hint="default"/>
+      </w:rPr>
+    </w:lvl>
+    <w:lvl w:ilvl="6" w:tplc="041D0001" w:tentative="1">
+      <w:start w:val="1"/>
+      <w:numFmt w:val="bullet"/>
+      <w:lvlText w:val=""/>
+      <w:lvlJc w:val="left"/>
+      <w:pPr>
+        <w:ind w:left="5040" w:hanging="360"/>
+      </w:pPr>
+      <w:rPr>
+        <w:rFonts w:ascii="Symbol" w:hAnsi="Symbol" w:hint="default"/>
+      </w:rPr>
+    </w:lvl>
+    <w:lvl w:ilvl="7" w:tplc="041D0003" w:tentative="1">
+      <w:start w:val="1"/>
+      <w:numFmt w:val="bullet"/>
+      <w:lvlText w:val="o"/>
+      <w:lvlJc w:val="left"/>
+      <w:pPr>
+        <w:ind w:left="5760" w:hanging="360"/>
+      </w:pPr>
+      <w:rPr>
+        <w:rFonts w:ascii="Courier New" w:hAnsi="Courier New" w:cs="Courier New" w:hint="default"/>
+      </w:rPr>
+    </w:lvl>
+    <w:lvl w:ilvl="8" w:tplc="041D0005" w:tentative="1">
+      <w:start w:val="1"/>
+      <w:numFmt w:val="bullet"/>
+      <w:lvlText w:val=""/>
+      <w:lvlJc w:val="left"/>
+      <w:pPr>
+        <w:ind w:left="6480" w:hanging="360"/>
       </w:pPr>
       <w:rPr>
         <w:rFonts w:ascii="Wingdings" w:hAnsi="Wingdings" w:hint="default"/>
@@ -5325,6 +5705,9 @@
   </w:num>
   <w:num w:numId="18" w16cid:durableId="352611108">
     <w:abstractNumId w:val="12"/>
+  </w:num>
+  <w:num w:numId="19" w16cid:durableId="1171213590">
+    <w:abstractNumId w:val="18"/>
   </w:num>
 </w:numbering>
 </file>

</xml_diff>

<commit_message>
feat: enhance media metadata handling and tag management
- Added support for additional metadata fields (tags, photographer, creator) in MediaManager and MediaSelector components.
- Implemented onSaveImageMeta function in MediaSelector to update media metadata.
- Introduced resolveMediaPathForExif utility to handle media paths for EXIF metadata.
- Added renameGlobalTag and deleteGlobalTag functions to manage global tags in useAppContext.
- Implemented getTagStats to retrieve statistics on tags used across media items.
</commit_message>
<xml_diff>
--- a/docs/släktträd.docx
+++ b/docs/släktträd.docx
@@ -254,7 +254,13 @@
     </w:p>
     <w:p>
       <w:r>
-        <w:t>ImageEditorModal – Bildvisare med redigeringsverktyg</w:t>
+        <w:t>ImageViewer.jsx</w:t>
+      </w:r>
+      <w:r>
+        <w:t xml:space="preserve"> </w:t>
+      </w:r>
+      <w:r>
+        <w:t>– Bildvisare med redigeringsverktyg</w:t>
       </w:r>
     </w:p>
     <w:p>
@@ -338,6 +344,63 @@
       </w:r>
     </w:p>
     <w:p>
+      <w:r>
+        <w:t>LinkPersonModal</w:t>
+      </w:r>
+      <w:r>
+        <w:t xml:space="preserve"> – När man länkar en person till något.</w:t>
+      </w:r>
+    </w:p>
+    <w:p>
+      <w:pPr>
+        <w:pStyle w:val="ListParagraph"/>
+        <w:numPr>
+          <w:ilvl w:val="0"/>
+          <w:numId w:val="21"/>
+        </w:numPr>
+      </w:pPr>
+      <w:r>
+        <w:t>Sök fritext, men som standard så visas dem 5 senaste profilerna man öppnat eller redigerat.</w:t>
+      </w:r>
+    </w:p>
+    <w:p>
+      <w:pPr>
+        <w:pStyle w:val="ListParagraph"/>
+        <w:numPr>
+          <w:ilvl w:val="0"/>
+          <w:numId w:val="21"/>
+        </w:numPr>
+      </w:pPr>
+      <w:r>
+        <w:t>Man ska kunna filtrera</w:t>
+      </w:r>
+    </w:p>
+    <w:p>
+      <w:pPr>
+        <w:pStyle w:val="ListParagraph"/>
+        <w:numPr>
+          <w:ilvl w:val="0"/>
+          <w:numId w:val="21"/>
+        </w:numPr>
+      </w:pPr>
+      <w:r>
+        <w:t>Man ska kunna se sin närmanste familj. Dvs syskon, föräldrar, barn, partners.</w:t>
+      </w:r>
+    </w:p>
+    <w:p>
+      <w:pPr>
+        <w:pStyle w:val="ListParagraph"/>
+        <w:numPr>
+          <w:ilvl w:val="0"/>
+          <w:numId w:val="21"/>
+        </w:numPr>
+      </w:pPr>
+      <w:r>
+        <w:lastRenderedPageBreak/>
+        <w:t>Se thumb på personerna när man söker samt Ref – F.namn, E. Namn (åååå-åååå)</w:t>
+      </w:r>
+    </w:p>
+    <w:p>
       <w:pPr>
         <w:pStyle w:val="Heading1"/>
       </w:pPr>
@@ -365,7 +428,6 @@
         <w:rPr>
           <w:lang w:val="en-US"/>
         </w:rPr>
-        <w:lastRenderedPageBreak/>
         <w:t>FS: https://www.familysearch.org/sv/tree/person/details/L1QK-C58</w:t>
       </w:r>
     </w:p>
@@ -704,6 +766,7 @@
     </w:p>
     <w:p>
       <w:r>
+        <w:lastRenderedPageBreak/>
         <w:t xml:space="preserve">  förvaringsplats</w:t>
       </w:r>
     </w:p>
@@ -729,7 +792,6 @@
     </w:p>
     <w:p>
       <w:r>
-        <w:lastRenderedPageBreak/>
         <w:t xml:space="preserve">  Förekomst</w:t>
       </w:r>
     </w:p>
@@ -1230,6 +1292,7 @@
         <w:rPr>
           <w:strike/>
         </w:rPr>
+        <w:lastRenderedPageBreak/>
         <w:t>Lägga till en ikon i editpersonmodal samt i personregistret som tar en t</w:t>
       </w:r>
       <w:r>
@@ -1374,7 +1437,6 @@
         <w:rPr>
           <w:strike/>
         </w:rPr>
-        <w:lastRenderedPageBreak/>
         <w:t>Radera händelse</w:t>
       </w:r>
     </w:p>
@@ -1681,6 +1743,7 @@
         <w:pStyle w:val="Heading2"/>
       </w:pPr>
       <w:r>
+        <w:lastRenderedPageBreak/>
         <w:t>Kyrkogårdar</w:t>
       </w:r>
     </w:p>
@@ -1731,7 +1794,6 @@
         </w:numPr>
       </w:pPr>
       <w:r>
-        <w:lastRenderedPageBreak/>
         <w:t>Minikarta i nedre högra hörnet</w:t>
       </w:r>
     </w:p>
@@ -1909,6 +1971,18 @@
     </w:p>
     <w:p>
       <w:pPr>
+        <w:pStyle w:val="ListParagraph"/>
+        <w:numPr>
+          <w:ilvl w:val="0"/>
+          <w:numId w:val="22"/>
+        </w:numPr>
+      </w:pPr>
+      <w:r>
+        <w:t>Bilder med GPS ska kunna synas på kartan</w:t>
+      </w:r>
+    </w:p>
+    <w:p>
+      <w:pPr>
         <w:pStyle w:val="Heading2"/>
       </w:pPr>
       <w:r>
@@ -2004,6 +2078,7 @@
         </w:numPr>
       </w:pPr>
       <w:r>
+        <w:lastRenderedPageBreak/>
         <w:t>Backup</w:t>
       </w:r>
     </w:p>
@@ -2103,7 +2178,6 @@
         </w:numPr>
       </w:pPr>
       <w:r>
-        <w:lastRenderedPageBreak/>
         <w:t>Namn-standardisering: Ett verktyg som hittar alla varianter av "Pehr", "Pär", "Per" och föreslår en standardisering.</w:t>
       </w:r>
     </w:p>
@@ -2394,6 +2468,7 @@
         </w:numPr>
       </w:pPr>
       <w:r>
+        <w:lastRenderedPageBreak/>
         <w:t>Idé: En funktion som automatiskt skannar din databas efter logiska fel och visar en varningslista.</w:t>
       </w:r>
     </w:p>
@@ -2496,18 +2571,6 @@
         </w:numPr>
       </w:pPr>
       <w:r>
-        <w:t>Tangentbordsgenvägar: N för Ny person, S för Spara, Ctrl+F för Sök. Gör det blixtsnabbt att jobba.</w:t>
-      </w:r>
-    </w:p>
-    <w:p>
-      <w:pPr>
-        <w:pStyle w:val="ListParagraph"/>
-        <w:numPr>
-          <w:ilvl w:val="0"/>
-          <w:numId w:val="9"/>
-        </w:numPr>
-      </w:pPr>
-      <w:r>
         <w:t>Visa i livshändelser i editpersonmodal on/off toggle:</w:t>
       </w:r>
     </w:p>
@@ -2622,6 +2685,9 @@
       <w:r>
         <w:t>Esc = Avbryt och stäng modal. Bekräftelse först!</w:t>
       </w:r>
+      <w:r>
+        <w:t xml:space="preserve"> Bekräftelse först om ändringar är gjorda</w:t>
+      </w:r>
     </w:p>
     <w:p>
       <w:pPr>
@@ -2632,7 +2698,7 @@
         </w:numPr>
       </w:pPr>
       <w:r>
-        <w:t>+/- = Förstora bild/förminska bilder</w:t>
+        <w:t>+/- = Förstora bild/förminska bild</w:t>
       </w:r>
       <w:r>
         <w:t xml:space="preserve"> </w:t>
@@ -2709,233 +2775,407 @@
     </w:p>
     <w:p>
       <w:pPr>
-        <w:pStyle w:val="Heading1"/>
-      </w:pPr>
-      <w:r>
-        <w:t>PROBLEM</w:t>
-      </w:r>
-    </w:p>
-    <w:p>
-      <w:pPr>
-        <w:pStyle w:val="ListParagraph"/>
-        <w:numPr>
-          <w:ilvl w:val="0"/>
-          <w:numId w:val="1"/>
-        </w:numPr>
-      </w:pPr>
-      <w:r>
-        <w:t>Relationsstigen är mycket svår at få rätt. blir fel varje gång eller så tas den bort!</w:t>
-      </w:r>
-    </w:p>
-    <w:p>
-      <w:pPr>
-        <w:pStyle w:val="ListParagraph"/>
-        <w:numPr>
-          <w:ilvl w:val="0"/>
-          <w:numId w:val="1"/>
-        </w:numPr>
-      </w:pPr>
-      <w:r>
-        <w:t>Om man skapat Svenstorp (M) AI:7 (1869-1878) Bild 3 (AID: v112348.b3, NAD: SE/LLA/13385) så går det inte att skapa i samma bok</w:t>
-      </w:r>
-      <w:r>
-        <w:t xml:space="preserve"> från andra sidor.</w:t>
-      </w:r>
-    </w:p>
-    <w:p>
-      <w:pPr>
-        <w:pStyle w:val="ListParagraph"/>
-        <w:numPr>
-          <w:ilvl w:val="0"/>
-          <w:numId w:val="1"/>
-        </w:numPr>
-      </w:pPr>
-      <w:r>
-        <w:t>M</w:t>
-      </w:r>
-      <w:r>
-        <w:t>e</w:t>
-      </w:r>
-      <w:r>
-        <w:t>rge funkar inte????</w:t>
-      </w:r>
-    </w:p>
-    <w:p>
-      <w:pPr>
-        <w:pStyle w:val="ListParagraph"/>
-        <w:numPr>
-          <w:ilvl w:val="0"/>
-          <w:numId w:val="1"/>
-        </w:numPr>
-      </w:pPr>
-      <w:r>
-        <w:t>Om du är inne i redigera person och trycker på "+koppla källa" så måste man trycka ESC 2grr.</w:t>
-      </w:r>
-    </w:p>
-    <w:p>
-      <w:pPr>
-        <w:pStyle w:val="ListParagraph"/>
-        <w:numPr>
-          <w:ilvl w:val="0"/>
-          <w:numId w:val="1"/>
-        </w:numPr>
-      </w:pPr>
-      <w:r>
-        <w:t>Släktträdets grena</w:t>
-      </w:r>
-      <w:r>
-        <w:t>r</w:t>
-      </w:r>
-      <w:r>
-        <w:t xml:space="preserve"> är OMG!!</w:t>
-      </w:r>
-    </w:p>
-    <w:p>
-      <w:pPr>
-        <w:pStyle w:val="ListParagraph"/>
-        <w:numPr>
-          <w:ilvl w:val="0"/>
-          <w:numId w:val="1"/>
-        </w:numPr>
-      </w:pPr>
-      <w:r>
-        <w:t>Siluetter/bilder överlag kan jag inte få att visa</w:t>
-      </w:r>
-    </w:p>
-    <w:p>
-      <w:pPr>
-        <w:pStyle w:val="ListParagraph"/>
-        <w:numPr>
-          <w:ilvl w:val="0"/>
-          <w:numId w:val="1"/>
-        </w:numPr>
-      </w:pPr>
-      <w:r>
-        <w:t>Facetaggen att följa med när fönstrets storlek ändras! Hållt på 2 dagar!</w:t>
-      </w:r>
-    </w:p>
-    <w:p/>
-    <w:p>
-      <w:pPr>
-        <w:pStyle w:val="Heading1"/>
-      </w:pPr>
-      <w:r>
-        <w:t xml:space="preserve">FEL </w:t>
-      </w:r>
-      <w:r>
-        <w:t xml:space="preserve">Småsaker - </w:t>
-      </w:r>
-      <w:r>
-        <w:t>KÄLLKATALOG</w:t>
-      </w:r>
-    </w:p>
-    <w:p>
-      <w:r>
-        <w:t xml:space="preserve">  -I redigera Arkiv Digital källa: RA-bildid ska heta "SVAR Bild-ID"</w:t>
-      </w:r>
-    </w:p>
-    <w:p>
-      <w:r>
-        <w:t xml:space="preserve">  -I redigera Arkiv Digital källa: NAD ska innehålla en blå knapp till höger precis som AID, i den ska det står NAD.</w:t>
-      </w:r>
-    </w:p>
-    <w:p>
-      <w:r>
-        <w:t xml:space="preserve">  -I redigera Arkiv Digital källa: Om där finns en notering i källan så ska det i källträdet finnas en grön knapp med ett (N). Kanppen ska vara längst till höger.</w:t>
-      </w:r>
-    </w:p>
-    <w:p>
-      <w:r>
-        <w:lastRenderedPageBreak/>
-        <w:t xml:space="preserve">  -I redigera Arkiv Digital källa: Knappen i fältet för AID ska heta AID och inte AD.</w:t>
-      </w:r>
-    </w:p>
-    <w:p>
-      <w:r>
-        <w:t xml:space="preserve">  -I redigera Arkiv Digital källa: Lägg till ny koppling ska öppna en minre modal som man kan söka på fritext, med avanserad sök och filter och kryssrutor. Man ska     även se personens närmaste familj såsom, partner,föräldrar,barn,syskon.</w:t>
-      </w:r>
-    </w:p>
-    <w:p>
-      <w:r>
-        <w:t xml:space="preserve">  -I redigera Arkiv Digital källa: När man skapar en tagg så efter man satt ett , så skapas en grön "knapp" med den tagg man skrev som inte går att trycka på. "," ska inte synas i knappen.</w:t>
-      </w:r>
-    </w:p>
-    <w:p>
-      <w:r>
-        <w:t xml:space="preserve">  -I redigera Arkiv Digital källa: Skulle jag vilja koppla Arkiv till platsregistret.</w:t>
-      </w:r>
-    </w:p>
-    <w:p>
-      <w:pPr>
-        <w:pStyle w:val="Heading1"/>
-      </w:pPr>
-      <w:r>
-        <w:t xml:space="preserve">FEL </w:t>
-      </w:r>
-      <w:r>
-        <w:t>Småsaker - PLATSREGISTRET</w:t>
-      </w:r>
-      <w:r>
-        <w:t xml:space="preserve"> </w:t>
-      </w:r>
-    </w:p>
-    <w:p>
-      <w:r>
-        <w:t xml:space="preserve"> -I Platsregistret: Skulle jag vilja ha parsing tex. från wikipedia länk? Helst: https://sok.riksarkivet.se/nad/?postid=Arkis+9396a96e-a0b0-11d3-9e53-009027b0fce9&amp;s=Balder</w:t>
-      </w:r>
-    </w:p>
-    <w:p>
-      <w:pPr>
-        <w:pStyle w:val="Heading1"/>
-      </w:pPr>
-      <w:r>
-        <w:t>PLATSER</w:t>
-      </w:r>
-    </w:p>
-    <w:p>
-      <w:r>
-        <w:t>Grundprincipen för PLAC</w:t>
-      </w:r>
-    </w:p>
-    <w:p>
-      <w:r>
-        <w:t xml:space="preserve">Sparas i offical </w:t>
-      </w:r>
-      <w:r>
         <w:rPr>
           <w:b/>
           <w:bCs/>
         </w:rPr>
-        <w:t xml:space="preserve">official_places.db </w:t>
-      </w:r>
-      <w:r>
-        <w:t>den som ja</w:t>
-      </w:r>
-      <w:r>
-        <w:t>g importerar från Lantmäteriet</w:t>
-      </w:r>
-      <w:r>
-        <w:t xml:space="preserve">. Sen har varje användare en egen DB för sina platser. Man ska kunna lägga till och ändra alla platser. Gör du en ändring i </w:t>
+      </w:pPr>
+      <w:r>
+        <w:t xml:space="preserve">Kortkommandon i </w:t>
       </w:r>
       <w:r>
         <w:rPr>
           <w:b/>
           <w:bCs/>
         </w:rPr>
-        <w:t>o</w:t>
+        <w:t>ImageViewer.jsx</w:t>
+      </w:r>
+    </w:p>
+    <w:p>
+      <w:pPr>
+        <w:pStyle w:val="ListParagraph"/>
+        <w:numPr>
+          <w:ilvl w:val="0"/>
+          <w:numId w:val="19"/>
+        </w:numPr>
+      </w:pPr>
+      <w:r>
+        <w:t>Esc = Avbryt och stäng modal. Bekräftelse först</w:t>
+      </w:r>
+      <w:r>
+        <w:t xml:space="preserve"> om ändringar är gjorda</w:t>
+      </w:r>
+      <w:r>
+        <w:t>!</w:t>
+      </w:r>
+    </w:p>
+    <w:p>
+      <w:pPr>
+        <w:pStyle w:val="ListParagraph"/>
+        <w:numPr>
+          <w:ilvl w:val="0"/>
+          <w:numId w:val="19"/>
+        </w:numPr>
+      </w:pPr>
+      <w:r>
+        <w:t>+/- = Förstora bild/förminska bild</w:t>
+      </w:r>
+    </w:p>
+    <w:p>
+      <w:pPr>
+        <w:pStyle w:val="ListParagraph"/>
+        <w:numPr>
+          <w:ilvl w:val="0"/>
+          <w:numId w:val="19"/>
+        </w:numPr>
+      </w:pPr>
+      <w:r>
+        <w:t xml:space="preserve">Piltangenterna = </w:t>
+      </w:r>
+      <w:r>
+        <w:t>Nästa/föregående bild</w:t>
+      </w:r>
+    </w:p>
+    <w:p>
+      <w:pPr>
+        <w:pStyle w:val="ListParagraph"/>
+        <w:numPr>
+          <w:ilvl w:val="0"/>
+          <w:numId w:val="19"/>
+        </w:numPr>
+      </w:pPr>
+      <w:r>
+        <w:t xml:space="preserve">CTRL+S= Spara </w:t>
+      </w:r>
+      <w:r>
+        <w:t>bild/metadata</w:t>
+      </w:r>
+    </w:p>
+    <w:p>
+      <w:pPr>
+        <w:pStyle w:val="ListParagraph"/>
+        <w:numPr>
+          <w:ilvl w:val="0"/>
+          <w:numId w:val="19"/>
+        </w:numPr>
+      </w:pPr>
+      <w:r>
+        <w:t>Del = I mediafliken på vald bild så ska den raderas, bekräftelse först, sen undotoast.</w:t>
+      </w:r>
+    </w:p>
+    <w:p>
+      <w:pPr>
+        <w:pStyle w:val="ListParagraph"/>
+        <w:numPr>
+          <w:ilvl w:val="0"/>
+          <w:numId w:val="19"/>
+        </w:numPr>
+      </w:pPr>
+      <w:r>
+        <w:t>P= Panoramaläge</w:t>
+      </w:r>
+    </w:p>
+    <w:p>
+      <w:pPr>
+        <w:pStyle w:val="ListParagraph"/>
+        <w:numPr>
+          <w:ilvl w:val="0"/>
+          <w:numId w:val="19"/>
+        </w:numPr>
+      </w:pPr>
+      <w:r>
+        <w:t>T= Facetagga personer</w:t>
+      </w:r>
+    </w:p>
+    <w:p>
+      <w:pPr>
+        <w:pStyle w:val="ListParagraph"/>
+        <w:numPr>
+          <w:ilvl w:val="0"/>
+          <w:numId w:val="19"/>
+        </w:numPr>
+      </w:pPr>
+      <w:r>
+        <w:t>A=Anpassa till vyn</w:t>
+      </w:r>
+    </w:p>
+    <w:p>
+      <w:pPr>
+        <w:pStyle w:val="ListParagraph"/>
+        <w:numPr>
+          <w:ilvl w:val="0"/>
+          <w:numId w:val="19"/>
+        </w:numPr>
+      </w:pPr>
+      <w:r>
+        <w:t>R= Rotera 90 grader</w:t>
+      </w:r>
+    </w:p>
+    <w:p>
+      <w:pPr>
+        <w:pStyle w:val="ListParagraph"/>
+        <w:numPr>
+          <w:ilvl w:val="0"/>
+          <w:numId w:val="19"/>
+        </w:numPr>
+      </w:pPr>
+      <w:r>
+        <w:t>H= Spegla horizentallt</w:t>
+      </w:r>
+    </w:p>
+    <w:p>
+      <w:pPr>
+        <w:pStyle w:val="ListParagraph"/>
+        <w:numPr>
+          <w:ilvl w:val="0"/>
+          <w:numId w:val="19"/>
+        </w:numPr>
+      </w:pPr>
+      <w:r>
+        <w:t>V= Spegla Vertikalt</w:t>
+      </w:r>
+    </w:p>
+    <w:p>
+      <w:pPr>
+        <w:pStyle w:val="ListParagraph"/>
+        <w:numPr>
+          <w:ilvl w:val="0"/>
+          <w:numId w:val="19"/>
+        </w:numPr>
+      </w:pPr>
+      <w:r>
+        <w:t>D= Dölj/visa ansiktsboxar</w:t>
+      </w:r>
+    </w:p>
+    <w:p>
+      <w:pPr>
+        <w:pStyle w:val="Heading1"/>
+      </w:pPr>
+      <w:r>
+        <w:lastRenderedPageBreak/>
+        <w:t>PROBLEM</w:t>
+      </w:r>
+    </w:p>
+    <w:p>
+      <w:pPr>
+        <w:pStyle w:val="ListParagraph"/>
+        <w:numPr>
+          <w:ilvl w:val="0"/>
+          <w:numId w:val="1"/>
+        </w:numPr>
+      </w:pPr>
+      <w:r>
+        <w:t>Relationsstigen är mycket svår at få rätt. blir fel varje gång eller så tas den bort!</w:t>
+      </w:r>
+    </w:p>
+    <w:p>
+      <w:pPr>
+        <w:pStyle w:val="ListParagraph"/>
+        <w:numPr>
+          <w:ilvl w:val="0"/>
+          <w:numId w:val="1"/>
+        </w:numPr>
+      </w:pPr>
+      <w:r>
+        <w:t>Om man skapat Svenstorp (M) AI:7 (1869-1878) Bild 3 (AID: v112348.b3, NAD: SE/LLA/13385) så går det inte att skapa i samma bok</w:t>
+      </w:r>
+      <w:r>
+        <w:t xml:space="preserve"> från andra sidor.</w:t>
+      </w:r>
+    </w:p>
+    <w:p>
+      <w:pPr>
+        <w:pStyle w:val="ListParagraph"/>
+        <w:numPr>
+          <w:ilvl w:val="0"/>
+          <w:numId w:val="1"/>
+        </w:numPr>
+      </w:pPr>
+      <w:r>
+        <w:t>M</w:t>
+      </w:r>
+      <w:r>
+        <w:t>e</w:t>
+      </w:r>
+      <w:r>
+        <w:t>rge funkar inte????</w:t>
+      </w:r>
+    </w:p>
+    <w:p>
+      <w:pPr>
+        <w:pStyle w:val="ListParagraph"/>
+        <w:numPr>
+          <w:ilvl w:val="0"/>
+          <w:numId w:val="1"/>
+        </w:numPr>
+      </w:pPr>
+      <w:r>
+        <w:t>Om du är inne i redigera person och trycker på "+koppla källa" så måste man trycka ESC 2grr.</w:t>
+      </w:r>
+    </w:p>
+    <w:p>
+      <w:pPr>
+        <w:pStyle w:val="ListParagraph"/>
+        <w:numPr>
+          <w:ilvl w:val="0"/>
+          <w:numId w:val="1"/>
+        </w:numPr>
+      </w:pPr>
+      <w:r>
+        <w:t>Släktträdets grena</w:t>
+      </w:r>
+      <w:r>
+        <w:t>r</w:t>
+      </w:r>
+      <w:r>
+        <w:t xml:space="preserve"> är OMG!!</w:t>
+      </w:r>
+    </w:p>
+    <w:p>
+      <w:pPr>
+        <w:pStyle w:val="ListParagraph"/>
+        <w:numPr>
+          <w:ilvl w:val="0"/>
+          <w:numId w:val="1"/>
+        </w:numPr>
+      </w:pPr>
+      <w:r>
+        <w:t>Siluetter/bilder överlag kan jag inte få att visa</w:t>
+      </w:r>
+    </w:p>
+    <w:p>
+      <w:pPr>
+        <w:pStyle w:val="ListParagraph"/>
+        <w:numPr>
+          <w:ilvl w:val="0"/>
+          <w:numId w:val="1"/>
+        </w:numPr>
+      </w:pPr>
+      <w:r>
+        <w:t>Facetaggen att följa med när fönstrets storlek ändras! Hållt på 2 dagar!</w:t>
+      </w:r>
+    </w:p>
+    <w:p/>
+    <w:p>
+      <w:pPr>
+        <w:pStyle w:val="Heading1"/>
+      </w:pPr>
+      <w:r>
+        <w:t xml:space="preserve">FEL </w:t>
+      </w:r>
+      <w:r>
+        <w:t xml:space="preserve">Småsaker - </w:t>
+      </w:r>
+      <w:r>
+        <w:t>KÄLLKATALOG</w:t>
+      </w:r>
+    </w:p>
+    <w:p>
+      <w:r>
+        <w:t xml:space="preserve">  -I redigera Arkiv Digital källa: RA-bildid ska heta "SVAR Bild-ID"</w:t>
+      </w:r>
+    </w:p>
+    <w:p>
+      <w:r>
+        <w:t xml:space="preserve">  -I redigera Arkiv Digital källa: NAD ska innehålla en blå knapp till höger precis som AID, i den ska det står NAD.</w:t>
+      </w:r>
+    </w:p>
+    <w:p>
+      <w:r>
+        <w:t xml:space="preserve">  -I redigera Arkiv Digital källa: Om där finns en notering i källan så ska det i källträdet finnas en grön knapp med ett (N). Kanppen ska vara längst till höger.</w:t>
+      </w:r>
+    </w:p>
+    <w:p>
+      <w:r>
+        <w:t xml:space="preserve">  -I redigera Arkiv Digital källa: Knappen i fältet för AID ska heta AID och inte AD.</w:t>
+      </w:r>
+    </w:p>
+    <w:p>
+      <w:r>
+        <w:t xml:space="preserve">  -I redigera Arkiv Digital källa: Lägg till ny koppling ska öppna en minre modal som man kan söka på fritext, med avanserad sök och filter och kryssrutor. Man ska     även se personens närmaste familj såsom, partner,föräldrar,barn,syskon.</w:t>
+      </w:r>
+    </w:p>
+    <w:p>
+      <w:r>
+        <w:t xml:space="preserve">  -I redigera Arkiv Digital källa: När man skapar en tagg så efter man satt ett , så skapas en grön "knapp" med den tagg man skrev som inte går att trycka på. "," ska inte synas i knappen.</w:t>
+      </w:r>
+    </w:p>
+    <w:p>
+      <w:r>
+        <w:t xml:space="preserve">  -I redigera Arkiv Digital källa: Skulle jag vilja koppla Arkiv till platsregistret.</w:t>
+      </w:r>
+    </w:p>
+    <w:p>
+      <w:pPr>
+        <w:pStyle w:val="Heading1"/>
+      </w:pPr>
+      <w:r>
+        <w:t xml:space="preserve">FEL </w:t>
+      </w:r>
+      <w:r>
+        <w:t>Småsaker - PLATSREGISTRET</w:t>
+      </w:r>
+      <w:r>
+        <w:t xml:space="preserve"> </w:t>
+      </w:r>
+    </w:p>
+    <w:p>
+      <w:r>
+        <w:t xml:space="preserve"> -I Platsregistret: Skulle jag vilja ha parsing tex. från wikipedia länk? Helst: https://sok.riksarkivet.se/nad/?postid=Arkis+9396a96e-a0b0-11d3-9e53-009027b0fce9&amp;s=Balder</w:t>
+      </w:r>
+    </w:p>
+    <w:p>
+      <w:pPr>
+        <w:pStyle w:val="Heading1"/>
+      </w:pPr>
+      <w:r>
+        <w:t>PLATSER</w:t>
+      </w:r>
+    </w:p>
+    <w:p>
+      <w:r>
+        <w:t>Grundprincipen för PLAC</w:t>
+      </w:r>
+    </w:p>
+    <w:p>
+      <w:r>
+        <w:t xml:space="preserve">Sparas i offical </w:t>
       </w:r>
       <w:r>
         <w:rPr>
           <w:b/>
           <w:bCs/>
         </w:rPr>
-        <w:t>fficial_places.db</w:t>
+        <w:t xml:space="preserve">official_places.db </w:t>
+      </w:r>
+      <w:r>
+        <w:t>den som ja</w:t>
+      </w:r>
+      <w:r>
+        <w:t>g importerar från Lantmäteriet</w:t>
+      </w:r>
+      <w:r>
+        <w:t xml:space="preserve">. Sen har varje användare en egen DB för sina platser. Man ska kunna lägga till och ändra alla platser. Gör du en ändring i </w:t>
       </w:r>
       <w:r>
         <w:rPr>
           <w:b/>
           <w:bCs/>
         </w:rPr>
+        <w:t>o</w:t>
+      </w:r>
+      <w:r>
+        <w:rPr>
+          <w:b/>
+          <w:bCs/>
+        </w:rPr>
+        <w:t>fficial_places.db</w:t>
+      </w:r>
+      <w:r>
+        <w:rPr>
+          <w:b/>
+          <w:bCs/>
+        </w:rPr>
         <w:t xml:space="preserve"> </w:t>
       </w:r>
       <w:r>
@@ -2953,7 +3193,11 @@
     </w:p>
     <w:p>
       <w:r>
-        <w:t>Om man importerar en GEDCOM så ska dem synkas med den officiella ELLER användarens egna platser. Dem som inte matchar ska hamna i en flik som heter ”Rätta” med passande ikon, på den fliken ska där stå antal som behöver redigeras. I fliken ska man kunna söka i fritex samt att där finns en knapp som heter koppla där man kan skriva i plats id elelr söka fritext och dela upp strängen efter lään, kommun, församling, ort osv.</w:t>
+        <w:t xml:space="preserve">Om man importerar en GEDCOM så ska dem synkas med den officiella ELLER användarens egna platser. Dem som inte matchar ska hamna i en flik som heter ”Rätta” med passande ikon, på den fliken ska där stå antal som behöver redigeras. I fliken ska man kunna söka i fritex samt att där finns en knapp som heter koppla där man kan skriva i plats id elelr söka fritext och dela upp strängen efter </w:t>
+      </w:r>
+      <w:r>
+        <w:lastRenderedPageBreak/>
+        <w:t>lään, kommun, församling, ort osv.</w:t>
       </w:r>
       <w:r>
         <w:br/>
@@ -3012,7 +3256,6 @@
     </w:p>
     <w:p>
       <w:r>
-        <w:lastRenderedPageBreak/>
         <w:t>1.</w:t>
       </w:r>
       <w:r>
@@ -3155,6 +3398,7 @@
     </w:p>
     <w:p>
       <w:r>
+        <w:lastRenderedPageBreak/>
         <w:t>Exempel i GEDCOM</w:t>
       </w:r>
     </w:p>
@@ -3320,7 +3564,6 @@
     </w:p>
     <w:p>
       <w:r>
-        <w:lastRenderedPageBreak/>
         <w:t>o</w:t>
       </w:r>
       <w:r>
@@ -3469,6 +3712,7 @@
     </w:p>
     <w:p>
       <w:r>
+        <w:lastRenderedPageBreak/>
         <w:t>Nivå 3</w:t>
       </w:r>
       <w:r>
@@ -3619,6 +3863,119 @@
     </w:lvl>
   </w:abstractNum>
   <w:abstractNum w:abstractNumId="1" w15:restartNumberingAfterBreak="0">
+    <w:nsid w:val="09290F43"/>
+    <w:multiLevelType w:val="hybridMultilevel"/>
+    <w:tmpl w:val="575CD54E"/>
+    <w:lvl w:ilvl="0" w:tplc="041D0001">
+      <w:start w:val="1"/>
+      <w:numFmt w:val="bullet"/>
+      <w:lvlText w:val=""/>
+      <w:lvlJc w:val="left"/>
+      <w:pPr>
+        <w:ind w:left="720" w:hanging="360"/>
+      </w:pPr>
+      <w:rPr>
+        <w:rFonts w:ascii="Symbol" w:hAnsi="Symbol" w:hint="default"/>
+      </w:rPr>
+    </w:lvl>
+    <w:lvl w:ilvl="1" w:tplc="041D0003" w:tentative="1">
+      <w:start w:val="1"/>
+      <w:numFmt w:val="bullet"/>
+      <w:lvlText w:val="o"/>
+      <w:lvlJc w:val="left"/>
+      <w:pPr>
+        <w:ind w:left="1440" w:hanging="360"/>
+      </w:pPr>
+      <w:rPr>
+        <w:rFonts w:ascii="Courier New" w:hAnsi="Courier New" w:cs="Courier New" w:hint="default"/>
+      </w:rPr>
+    </w:lvl>
+    <w:lvl w:ilvl="2" w:tplc="041D0005" w:tentative="1">
+      <w:start w:val="1"/>
+      <w:numFmt w:val="bullet"/>
+      <w:lvlText w:val=""/>
+      <w:lvlJc w:val="left"/>
+      <w:pPr>
+        <w:ind w:left="2160" w:hanging="360"/>
+      </w:pPr>
+      <w:rPr>
+        <w:rFonts w:ascii="Wingdings" w:hAnsi="Wingdings" w:hint="default"/>
+      </w:rPr>
+    </w:lvl>
+    <w:lvl w:ilvl="3" w:tplc="041D0001" w:tentative="1">
+      <w:start w:val="1"/>
+      <w:numFmt w:val="bullet"/>
+      <w:lvlText w:val=""/>
+      <w:lvlJc w:val="left"/>
+      <w:pPr>
+        <w:ind w:left="2880" w:hanging="360"/>
+      </w:pPr>
+      <w:rPr>
+        <w:rFonts w:ascii="Symbol" w:hAnsi="Symbol" w:hint="default"/>
+      </w:rPr>
+    </w:lvl>
+    <w:lvl w:ilvl="4" w:tplc="041D0003" w:tentative="1">
+      <w:start w:val="1"/>
+      <w:numFmt w:val="bullet"/>
+      <w:lvlText w:val="o"/>
+      <w:lvlJc w:val="left"/>
+      <w:pPr>
+        <w:ind w:left="3600" w:hanging="360"/>
+      </w:pPr>
+      <w:rPr>
+        <w:rFonts w:ascii="Courier New" w:hAnsi="Courier New" w:cs="Courier New" w:hint="default"/>
+      </w:rPr>
+    </w:lvl>
+    <w:lvl w:ilvl="5" w:tplc="041D0005" w:tentative="1">
+      <w:start w:val="1"/>
+      <w:numFmt w:val="bullet"/>
+      <w:lvlText w:val=""/>
+      <w:lvlJc w:val="left"/>
+      <w:pPr>
+        <w:ind w:left="4320" w:hanging="360"/>
+      </w:pPr>
+      <w:rPr>
+        <w:rFonts w:ascii="Wingdings" w:hAnsi="Wingdings" w:hint="default"/>
+      </w:rPr>
+    </w:lvl>
+    <w:lvl w:ilvl="6" w:tplc="041D0001" w:tentative="1">
+      <w:start w:val="1"/>
+      <w:numFmt w:val="bullet"/>
+      <w:lvlText w:val=""/>
+      <w:lvlJc w:val="left"/>
+      <w:pPr>
+        <w:ind w:left="5040" w:hanging="360"/>
+      </w:pPr>
+      <w:rPr>
+        <w:rFonts w:ascii="Symbol" w:hAnsi="Symbol" w:hint="default"/>
+      </w:rPr>
+    </w:lvl>
+    <w:lvl w:ilvl="7" w:tplc="041D0003" w:tentative="1">
+      <w:start w:val="1"/>
+      <w:numFmt w:val="bullet"/>
+      <w:lvlText w:val="o"/>
+      <w:lvlJc w:val="left"/>
+      <w:pPr>
+        <w:ind w:left="5760" w:hanging="360"/>
+      </w:pPr>
+      <w:rPr>
+        <w:rFonts w:ascii="Courier New" w:hAnsi="Courier New" w:cs="Courier New" w:hint="default"/>
+      </w:rPr>
+    </w:lvl>
+    <w:lvl w:ilvl="8" w:tplc="041D0005" w:tentative="1">
+      <w:start w:val="1"/>
+      <w:numFmt w:val="bullet"/>
+      <w:lvlText w:val=""/>
+      <w:lvlJc w:val="left"/>
+      <w:pPr>
+        <w:ind w:left="6480" w:hanging="360"/>
+      </w:pPr>
+      <w:rPr>
+        <w:rFonts w:ascii="Wingdings" w:hAnsi="Wingdings" w:hint="default"/>
+      </w:rPr>
+    </w:lvl>
+  </w:abstractNum>
+  <w:abstractNum w:abstractNumId="2" w15:restartNumberingAfterBreak="0">
     <w:nsid w:val="0E591EE1"/>
     <w:multiLevelType w:val="hybridMultilevel"/>
     <w:tmpl w:val="C79E6D10"/>
@@ -3731,7 +4088,7 @@
       </w:rPr>
     </w:lvl>
   </w:abstractNum>
-  <w:abstractNum w:abstractNumId="2" w15:restartNumberingAfterBreak="0">
+  <w:abstractNum w:abstractNumId="3" w15:restartNumberingAfterBreak="0">
     <w:nsid w:val="0FE8767A"/>
     <w:multiLevelType w:val="hybridMultilevel"/>
     <w:tmpl w:val="0ABAFE2C"/>
@@ -3844,7 +4201,7 @@
       </w:rPr>
     </w:lvl>
   </w:abstractNum>
-  <w:abstractNum w:abstractNumId="3" w15:restartNumberingAfterBreak="0">
+  <w:abstractNum w:abstractNumId="4" w15:restartNumberingAfterBreak="0">
     <w:nsid w:val="18540451"/>
     <w:multiLevelType w:val="hybridMultilevel"/>
     <w:tmpl w:val="12141176"/>
@@ -3957,7 +4314,7 @@
       </w:rPr>
     </w:lvl>
   </w:abstractNum>
-  <w:abstractNum w:abstractNumId="4" w15:restartNumberingAfterBreak="0">
+  <w:abstractNum w:abstractNumId="5" w15:restartNumberingAfterBreak="0">
     <w:nsid w:val="31D02BF7"/>
     <w:multiLevelType w:val="hybridMultilevel"/>
     <w:tmpl w:val="B1407482"/>
@@ -4070,7 +4427,7 @@
       </w:rPr>
     </w:lvl>
   </w:abstractNum>
-  <w:abstractNum w:abstractNumId="5" w15:restartNumberingAfterBreak="0">
+  <w:abstractNum w:abstractNumId="6" w15:restartNumberingAfterBreak="0">
     <w:nsid w:val="3459760A"/>
     <w:multiLevelType w:val="hybridMultilevel"/>
     <w:tmpl w:val="675EF1BE"/>
@@ -4183,7 +4540,7 @@
       </w:rPr>
     </w:lvl>
   </w:abstractNum>
-  <w:abstractNum w:abstractNumId="6" w15:restartNumberingAfterBreak="0">
+  <w:abstractNum w:abstractNumId="7" w15:restartNumberingAfterBreak="0">
     <w:nsid w:val="3BCC3A2F"/>
     <w:multiLevelType w:val="hybridMultilevel"/>
     <w:tmpl w:val="2E225524"/>
@@ -4296,7 +4653,7 @@
       </w:rPr>
     </w:lvl>
   </w:abstractNum>
-  <w:abstractNum w:abstractNumId="7" w15:restartNumberingAfterBreak="0">
+  <w:abstractNum w:abstractNumId="8" w15:restartNumberingAfterBreak="0">
     <w:nsid w:val="3C7351FE"/>
     <w:multiLevelType w:val="hybridMultilevel"/>
     <w:tmpl w:val="63CCF0FA"/>
@@ -4409,7 +4766,7 @@
       </w:rPr>
     </w:lvl>
   </w:abstractNum>
-  <w:abstractNum w:abstractNumId="8" w15:restartNumberingAfterBreak="0">
+  <w:abstractNum w:abstractNumId="9" w15:restartNumberingAfterBreak="0">
     <w:nsid w:val="40AB1479"/>
     <w:multiLevelType w:val="hybridMultilevel"/>
     <w:tmpl w:val="FD9E368E"/>
@@ -4522,7 +4879,7 @@
       </w:rPr>
     </w:lvl>
   </w:abstractNum>
-  <w:abstractNum w:abstractNumId="9" w15:restartNumberingAfterBreak="0">
+  <w:abstractNum w:abstractNumId="10" w15:restartNumberingAfterBreak="0">
     <w:nsid w:val="424344C3"/>
     <w:multiLevelType w:val="hybridMultilevel"/>
     <w:tmpl w:val="750E38B4"/>
@@ -4635,7 +4992,7 @@
       </w:rPr>
     </w:lvl>
   </w:abstractNum>
-  <w:abstractNum w:abstractNumId="10" w15:restartNumberingAfterBreak="0">
+  <w:abstractNum w:abstractNumId="11" w15:restartNumberingAfterBreak="0">
     <w:nsid w:val="44872AC6"/>
     <w:multiLevelType w:val="hybridMultilevel"/>
     <w:tmpl w:val="323687DE"/>
@@ -4748,7 +5105,7 @@
       </w:rPr>
     </w:lvl>
   </w:abstractNum>
-  <w:abstractNum w:abstractNumId="11" w15:restartNumberingAfterBreak="0">
+  <w:abstractNum w:abstractNumId="12" w15:restartNumberingAfterBreak="0">
     <w:nsid w:val="45075063"/>
     <w:multiLevelType w:val="hybridMultilevel"/>
     <w:tmpl w:val="1062FE3C"/>
@@ -4861,7 +5218,7 @@
       </w:rPr>
     </w:lvl>
   </w:abstractNum>
-  <w:abstractNum w:abstractNumId="12" w15:restartNumberingAfterBreak="0">
+  <w:abstractNum w:abstractNumId="13" w15:restartNumberingAfterBreak="0">
     <w:nsid w:val="45242857"/>
     <w:multiLevelType w:val="hybridMultilevel"/>
     <w:tmpl w:val="9CF4E5D2"/>
@@ -4974,7 +5331,120 @@
       </w:rPr>
     </w:lvl>
   </w:abstractNum>
-  <w:abstractNum w:abstractNumId="13" w15:restartNumberingAfterBreak="0">
+  <w:abstractNum w:abstractNumId="14" w15:restartNumberingAfterBreak="0">
+    <w:nsid w:val="470A12FB"/>
+    <w:multiLevelType w:val="hybridMultilevel"/>
+    <w:tmpl w:val="BD363F30"/>
+    <w:lvl w:ilvl="0" w:tplc="041D0001">
+      <w:start w:val="1"/>
+      <w:numFmt w:val="bullet"/>
+      <w:lvlText w:val=""/>
+      <w:lvlJc w:val="left"/>
+      <w:pPr>
+        <w:ind w:left="720" w:hanging="360"/>
+      </w:pPr>
+      <w:rPr>
+        <w:rFonts w:ascii="Symbol" w:hAnsi="Symbol" w:hint="default"/>
+      </w:rPr>
+    </w:lvl>
+    <w:lvl w:ilvl="1" w:tplc="041D0003" w:tentative="1">
+      <w:start w:val="1"/>
+      <w:numFmt w:val="bullet"/>
+      <w:lvlText w:val="o"/>
+      <w:lvlJc w:val="left"/>
+      <w:pPr>
+        <w:ind w:left="1440" w:hanging="360"/>
+      </w:pPr>
+      <w:rPr>
+        <w:rFonts w:ascii="Courier New" w:hAnsi="Courier New" w:cs="Courier New" w:hint="default"/>
+      </w:rPr>
+    </w:lvl>
+    <w:lvl w:ilvl="2" w:tplc="041D0005" w:tentative="1">
+      <w:start w:val="1"/>
+      <w:numFmt w:val="bullet"/>
+      <w:lvlText w:val=""/>
+      <w:lvlJc w:val="left"/>
+      <w:pPr>
+        <w:ind w:left="2160" w:hanging="360"/>
+      </w:pPr>
+      <w:rPr>
+        <w:rFonts w:ascii="Wingdings" w:hAnsi="Wingdings" w:hint="default"/>
+      </w:rPr>
+    </w:lvl>
+    <w:lvl w:ilvl="3" w:tplc="041D0001" w:tentative="1">
+      <w:start w:val="1"/>
+      <w:numFmt w:val="bullet"/>
+      <w:lvlText w:val=""/>
+      <w:lvlJc w:val="left"/>
+      <w:pPr>
+        <w:ind w:left="2880" w:hanging="360"/>
+      </w:pPr>
+      <w:rPr>
+        <w:rFonts w:ascii="Symbol" w:hAnsi="Symbol" w:hint="default"/>
+      </w:rPr>
+    </w:lvl>
+    <w:lvl w:ilvl="4" w:tplc="041D0003" w:tentative="1">
+      <w:start w:val="1"/>
+      <w:numFmt w:val="bullet"/>
+      <w:lvlText w:val="o"/>
+      <w:lvlJc w:val="left"/>
+      <w:pPr>
+        <w:ind w:left="3600" w:hanging="360"/>
+      </w:pPr>
+      <w:rPr>
+        <w:rFonts w:ascii="Courier New" w:hAnsi="Courier New" w:cs="Courier New" w:hint="default"/>
+      </w:rPr>
+    </w:lvl>
+    <w:lvl w:ilvl="5" w:tplc="041D0005" w:tentative="1">
+      <w:start w:val="1"/>
+      <w:numFmt w:val="bullet"/>
+      <w:lvlText w:val=""/>
+      <w:lvlJc w:val="left"/>
+      <w:pPr>
+        <w:ind w:left="4320" w:hanging="360"/>
+      </w:pPr>
+      <w:rPr>
+        <w:rFonts w:ascii="Wingdings" w:hAnsi="Wingdings" w:hint="default"/>
+      </w:rPr>
+    </w:lvl>
+    <w:lvl w:ilvl="6" w:tplc="041D0001" w:tentative="1">
+      <w:start w:val="1"/>
+      <w:numFmt w:val="bullet"/>
+      <w:lvlText w:val=""/>
+      <w:lvlJc w:val="left"/>
+      <w:pPr>
+        <w:ind w:left="5040" w:hanging="360"/>
+      </w:pPr>
+      <w:rPr>
+        <w:rFonts w:ascii="Symbol" w:hAnsi="Symbol" w:hint="default"/>
+      </w:rPr>
+    </w:lvl>
+    <w:lvl w:ilvl="7" w:tplc="041D0003" w:tentative="1">
+      <w:start w:val="1"/>
+      <w:numFmt w:val="bullet"/>
+      <w:lvlText w:val="o"/>
+      <w:lvlJc w:val="left"/>
+      <w:pPr>
+        <w:ind w:left="5760" w:hanging="360"/>
+      </w:pPr>
+      <w:rPr>
+        <w:rFonts w:ascii="Courier New" w:hAnsi="Courier New" w:cs="Courier New" w:hint="default"/>
+      </w:rPr>
+    </w:lvl>
+    <w:lvl w:ilvl="8" w:tplc="041D0005" w:tentative="1">
+      <w:start w:val="1"/>
+      <w:numFmt w:val="bullet"/>
+      <w:lvlText w:val=""/>
+      <w:lvlJc w:val="left"/>
+      <w:pPr>
+        <w:ind w:left="6480" w:hanging="360"/>
+      </w:pPr>
+      <w:rPr>
+        <w:rFonts w:ascii="Wingdings" w:hAnsi="Wingdings" w:hint="default"/>
+      </w:rPr>
+    </w:lvl>
+  </w:abstractNum>
+  <w:abstractNum w:abstractNumId="15" w15:restartNumberingAfterBreak="0">
     <w:nsid w:val="4B1A5841"/>
     <w:multiLevelType w:val="hybridMultilevel"/>
     <w:tmpl w:val="E1AC38E6"/>
@@ -5087,7 +5557,7 @@
       </w:rPr>
     </w:lvl>
   </w:abstractNum>
-  <w:abstractNum w:abstractNumId="14" w15:restartNumberingAfterBreak="0">
+  <w:abstractNum w:abstractNumId="16" w15:restartNumberingAfterBreak="0">
     <w:nsid w:val="50C97E8C"/>
     <w:multiLevelType w:val="hybridMultilevel"/>
     <w:tmpl w:val="9352141C"/>
@@ -5200,7 +5670,7 @@
       </w:rPr>
     </w:lvl>
   </w:abstractNum>
-  <w:abstractNum w:abstractNumId="15" w15:restartNumberingAfterBreak="0">
+  <w:abstractNum w:abstractNumId="17" w15:restartNumberingAfterBreak="0">
     <w:nsid w:val="630043EE"/>
     <w:multiLevelType w:val="hybridMultilevel"/>
     <w:tmpl w:val="5D6C5982"/>
@@ -5313,7 +5783,7 @@
       </w:rPr>
     </w:lvl>
   </w:abstractNum>
-  <w:abstractNum w:abstractNumId="16" w15:restartNumberingAfterBreak="0">
+  <w:abstractNum w:abstractNumId="18" w15:restartNumberingAfterBreak="0">
     <w:nsid w:val="6EAE64CC"/>
     <w:multiLevelType w:val="hybridMultilevel"/>
     <w:tmpl w:val="56B61DA6"/>
@@ -5426,7 +5896,7 @@
       </w:rPr>
     </w:lvl>
   </w:abstractNum>
-  <w:abstractNum w:abstractNumId="17" w15:restartNumberingAfterBreak="0">
+  <w:abstractNum w:abstractNumId="19" w15:restartNumberingAfterBreak="0">
     <w:nsid w:val="7096753B"/>
     <w:multiLevelType w:val="hybridMultilevel"/>
     <w:tmpl w:val="4C42F042"/>
@@ -5539,7 +6009,7 @@
       </w:rPr>
     </w:lvl>
   </w:abstractNum>
-  <w:abstractNum w:abstractNumId="18" w15:restartNumberingAfterBreak="0">
+  <w:abstractNum w:abstractNumId="20" w15:restartNumberingAfterBreak="0">
     <w:nsid w:val="792421DB"/>
     <w:multiLevelType w:val="hybridMultilevel"/>
     <w:tmpl w:val="EC94815E"/>
@@ -5652,62 +6122,183 @@
       </w:rPr>
     </w:lvl>
   </w:abstractNum>
+  <w:abstractNum w:abstractNumId="21" w15:restartNumberingAfterBreak="0">
+    <w:nsid w:val="7DA61E08"/>
+    <w:multiLevelType w:val="hybridMultilevel"/>
+    <w:tmpl w:val="2E7C9934"/>
+    <w:lvl w:ilvl="0" w:tplc="041D0001">
+      <w:start w:val="1"/>
+      <w:numFmt w:val="bullet"/>
+      <w:lvlText w:val=""/>
+      <w:lvlJc w:val="left"/>
+      <w:pPr>
+        <w:ind w:left="720" w:hanging="360"/>
+      </w:pPr>
+      <w:rPr>
+        <w:rFonts w:ascii="Symbol" w:hAnsi="Symbol" w:hint="default"/>
+      </w:rPr>
+    </w:lvl>
+    <w:lvl w:ilvl="1" w:tplc="DA021DCA">
+      <w:numFmt w:val="bullet"/>
+      <w:lvlText w:val="-"/>
+      <w:lvlJc w:val="left"/>
+      <w:pPr>
+        <w:ind w:left="1440" w:hanging="360"/>
+      </w:pPr>
+      <w:rPr>
+        <w:rFonts w:ascii="Calibri" w:eastAsiaTheme="minorHAnsi" w:hAnsi="Calibri" w:cs="Calibri" w:hint="default"/>
+      </w:rPr>
+    </w:lvl>
+    <w:lvl w:ilvl="2" w:tplc="041D0005">
+      <w:start w:val="1"/>
+      <w:numFmt w:val="bullet"/>
+      <w:lvlText w:val=""/>
+      <w:lvlJc w:val="left"/>
+      <w:pPr>
+        <w:ind w:left="2160" w:hanging="360"/>
+      </w:pPr>
+      <w:rPr>
+        <w:rFonts w:ascii="Wingdings" w:hAnsi="Wingdings" w:hint="default"/>
+      </w:rPr>
+    </w:lvl>
+    <w:lvl w:ilvl="3" w:tplc="041D0001" w:tentative="1">
+      <w:start w:val="1"/>
+      <w:numFmt w:val="bullet"/>
+      <w:lvlText w:val=""/>
+      <w:lvlJc w:val="left"/>
+      <w:pPr>
+        <w:ind w:left="2880" w:hanging="360"/>
+      </w:pPr>
+      <w:rPr>
+        <w:rFonts w:ascii="Symbol" w:hAnsi="Symbol" w:hint="default"/>
+      </w:rPr>
+    </w:lvl>
+    <w:lvl w:ilvl="4" w:tplc="041D0003" w:tentative="1">
+      <w:start w:val="1"/>
+      <w:numFmt w:val="bullet"/>
+      <w:lvlText w:val="o"/>
+      <w:lvlJc w:val="left"/>
+      <w:pPr>
+        <w:ind w:left="3600" w:hanging="360"/>
+      </w:pPr>
+      <w:rPr>
+        <w:rFonts w:ascii="Courier New" w:hAnsi="Courier New" w:cs="Courier New" w:hint="default"/>
+      </w:rPr>
+    </w:lvl>
+    <w:lvl w:ilvl="5" w:tplc="041D0005" w:tentative="1">
+      <w:start w:val="1"/>
+      <w:numFmt w:val="bullet"/>
+      <w:lvlText w:val=""/>
+      <w:lvlJc w:val="left"/>
+      <w:pPr>
+        <w:ind w:left="4320" w:hanging="360"/>
+      </w:pPr>
+      <w:rPr>
+        <w:rFonts w:ascii="Wingdings" w:hAnsi="Wingdings" w:hint="default"/>
+      </w:rPr>
+    </w:lvl>
+    <w:lvl w:ilvl="6" w:tplc="041D0001" w:tentative="1">
+      <w:start w:val="1"/>
+      <w:numFmt w:val="bullet"/>
+      <w:lvlText w:val=""/>
+      <w:lvlJc w:val="left"/>
+      <w:pPr>
+        <w:ind w:left="5040" w:hanging="360"/>
+      </w:pPr>
+      <w:rPr>
+        <w:rFonts w:ascii="Symbol" w:hAnsi="Symbol" w:hint="default"/>
+      </w:rPr>
+    </w:lvl>
+    <w:lvl w:ilvl="7" w:tplc="041D0003" w:tentative="1">
+      <w:start w:val="1"/>
+      <w:numFmt w:val="bullet"/>
+      <w:lvlText w:val="o"/>
+      <w:lvlJc w:val="left"/>
+      <w:pPr>
+        <w:ind w:left="5760" w:hanging="360"/>
+      </w:pPr>
+      <w:rPr>
+        <w:rFonts w:ascii="Courier New" w:hAnsi="Courier New" w:cs="Courier New" w:hint="default"/>
+      </w:rPr>
+    </w:lvl>
+    <w:lvl w:ilvl="8" w:tplc="041D0005" w:tentative="1">
+      <w:start w:val="1"/>
+      <w:numFmt w:val="bullet"/>
+      <w:lvlText w:val=""/>
+      <w:lvlJc w:val="left"/>
+      <w:pPr>
+        <w:ind w:left="6480" w:hanging="360"/>
+      </w:pPr>
+      <w:rPr>
+        <w:rFonts w:ascii="Wingdings" w:hAnsi="Wingdings" w:hint="default"/>
+      </w:rPr>
+    </w:lvl>
+  </w:abstractNum>
   <w:num w:numId="1" w16cid:durableId="971669405">
-    <w:abstractNumId w:val="2"/>
+    <w:abstractNumId w:val="3"/>
   </w:num>
   <w:num w:numId="2" w16cid:durableId="908343654">
+    <w:abstractNumId w:val="9"/>
+  </w:num>
+  <w:num w:numId="3" w16cid:durableId="279648275">
+    <w:abstractNumId w:val="16"/>
+  </w:num>
+  <w:num w:numId="4" w16cid:durableId="1103067784">
+    <w:abstractNumId w:val="4"/>
+  </w:num>
+  <w:num w:numId="5" w16cid:durableId="641234282">
+    <w:abstractNumId w:val="12"/>
+  </w:num>
+  <w:num w:numId="6" w16cid:durableId="1973635211">
+    <w:abstractNumId w:val="15"/>
+  </w:num>
+  <w:num w:numId="7" w16cid:durableId="424032255">
+    <w:abstractNumId w:val="19"/>
+  </w:num>
+  <w:num w:numId="8" w16cid:durableId="272596165">
+    <w:abstractNumId w:val="17"/>
+  </w:num>
+  <w:num w:numId="9" w16cid:durableId="2049720405">
+    <w:abstractNumId w:val="10"/>
+  </w:num>
+  <w:num w:numId="10" w16cid:durableId="43217905">
+    <w:abstractNumId w:val="11"/>
+  </w:num>
+  <w:num w:numId="11" w16cid:durableId="202324696">
     <w:abstractNumId w:val="8"/>
   </w:num>
-  <w:num w:numId="3" w16cid:durableId="279648275">
-    <w:abstractNumId w:val="14"/>
-  </w:num>
-  <w:num w:numId="4" w16cid:durableId="1103067784">
-    <w:abstractNumId w:val="3"/>
-  </w:num>
-  <w:num w:numId="5" w16cid:durableId="641234282">
-    <w:abstractNumId w:val="11"/>
-  </w:num>
-  <w:num w:numId="6" w16cid:durableId="1973635211">
-    <w:abstractNumId w:val="13"/>
-  </w:num>
-  <w:num w:numId="7" w16cid:durableId="424032255">
-    <w:abstractNumId w:val="17"/>
-  </w:num>
-  <w:num w:numId="8" w16cid:durableId="272596165">
-    <w:abstractNumId w:val="15"/>
-  </w:num>
-  <w:num w:numId="9" w16cid:durableId="2049720405">
-    <w:abstractNumId w:val="9"/>
-  </w:num>
-  <w:num w:numId="10" w16cid:durableId="43217905">
-    <w:abstractNumId w:val="10"/>
-  </w:num>
-  <w:num w:numId="11" w16cid:durableId="202324696">
-    <w:abstractNumId w:val="7"/>
-  </w:num>
   <w:num w:numId="12" w16cid:durableId="946356118">
-    <w:abstractNumId w:val="4"/>
+    <w:abstractNumId w:val="5"/>
   </w:num>
   <w:num w:numId="13" w16cid:durableId="948700132">
     <w:abstractNumId w:val="0"/>
   </w:num>
   <w:num w:numId="14" w16cid:durableId="499009661">
-    <w:abstractNumId w:val="5"/>
+    <w:abstractNumId w:val="6"/>
   </w:num>
   <w:num w:numId="15" w16cid:durableId="482770689">
-    <w:abstractNumId w:val="1"/>
+    <w:abstractNumId w:val="2"/>
   </w:num>
   <w:num w:numId="16" w16cid:durableId="1126192118">
-    <w:abstractNumId w:val="6"/>
+    <w:abstractNumId w:val="7"/>
   </w:num>
   <w:num w:numId="17" w16cid:durableId="384765121">
-    <w:abstractNumId w:val="16"/>
+    <w:abstractNumId w:val="18"/>
   </w:num>
   <w:num w:numId="18" w16cid:durableId="352611108">
-    <w:abstractNumId w:val="12"/>
+    <w:abstractNumId w:val="13"/>
   </w:num>
   <w:num w:numId="19" w16cid:durableId="1171213590">
-    <w:abstractNumId w:val="18"/>
+    <w:abstractNumId w:val="20"/>
+  </w:num>
+  <w:num w:numId="20" w16cid:durableId="1244531712">
+    <w:abstractNumId w:val="21"/>
+  </w:num>
+  <w:num w:numId="21" w16cid:durableId="465009803">
+    <w:abstractNumId w:val="14"/>
+  </w:num>
+  <w:num w:numId="22" w16cid:durableId="1383554267">
+    <w:abstractNumId w:val="1"/>
   </w:num>
 </w:numbering>
 </file>

</xml_diff>

<commit_message>
Refactor MediaManager and Status/Undo Toast components; update tag handling logic in useAppContext
- Removed unused imports and optimized existing ones in MediaManager.jsx.
- Adjusted z-index values for StatusToast and UndoToast components to ensure proper visibility.
- Enhanced tag path mapping logic in useAppContext.js to improve media and metadata handling.
- Introduced a new design system and UI rules document for consistent UI generation and modifications.
</commit_message>
<xml_diff>
--- a/docs/släktträd.docx
+++ b/docs/släktträd.docx
@@ -40,57 +40,53 @@
         <w:rPr>
           <w:lang w:val="en-US"/>
         </w:rPr>
-        <w:t>React/Electron → (HTTP-</w:t>
-      </w:r>
-      <w:proofErr w:type="spellStart"/>
-      <w:r>
+        <w:t>React/Electron → (HTTP-anrop, t.ex. fetch) → Flask (Python) → (SQL) → SQLite-databas</w:t>
+      </w:r>
+    </w:p>
+    <w:p>
+      <w:pPr>
+        <w:pStyle w:val="Heading1"/>
         <w:rPr>
           <w:lang w:val="en-US"/>
         </w:rPr>
-        <w:t>anrop</w:t>
-      </w:r>
-      <w:proofErr w:type="spellEnd"/>
+      </w:pPr>
       <w:r>
         <w:rPr>
           <w:lang w:val="en-US"/>
         </w:rPr>
-        <w:t xml:space="preserve">, </w:t>
-      </w:r>
-      <w:proofErr w:type="spellStart"/>
-      <w:r>
+        <w:t>STARTA SERVER &amp; ELECTRON</w:t>
+      </w:r>
+    </w:p>
+    <w:p>
+      <w:pPr>
         <w:rPr>
           <w:lang w:val="en-US"/>
         </w:rPr>
-        <w:t>t.ex</w:t>
-      </w:r>
-      <w:proofErr w:type="spellEnd"/>
+      </w:pPr>
       <w:r>
         <w:rPr>
           <w:lang w:val="en-US"/>
         </w:rPr>
-        <w:t>. fetch) → Flask (Python) → (SQL) → SQLite-</w:t>
-      </w:r>
-      <w:proofErr w:type="spellStart"/>
-      <w:r>
+        <w:t>C:\Users\denni\Documents\Dennis\programmering\WestFamilyTree\WestFamilyTree&gt; npm run dev</w:t>
+      </w:r>
+    </w:p>
+    <w:p>
+      <w:pPr>
         <w:rPr>
           <w:lang w:val="en-US"/>
         </w:rPr>
-        <w:t>databas</w:t>
-      </w:r>
-      <w:proofErr w:type="spellEnd"/>
-    </w:p>
-    <w:p>
-      <w:pPr>
-        <w:pStyle w:val="Heading1"/>
+      </w:pPr>
+      <w:r>
         <w:rPr>
           <w:lang w:val="en-US"/>
         </w:rPr>
-      </w:pPr>
+        <w:t xml:space="preserve">C:\Users\denni\Documents\Dennis\programmering\WestFamilyTree\WestFamilyTree&gt; </w:t>
+      </w:r>
       <w:r>
         <w:rPr>
           <w:lang w:val="en-US"/>
         </w:rPr>
-        <w:t>STARTA SERVER &amp; ELECTRON</w:t>
+        <w:t>python api_server_cors.py</w:t>
       </w:r>
     </w:p>
     <w:p>
@@ -105,84 +101,30 @@
         </w:rPr>
         <w:t xml:space="preserve">C:\Users\denni\Documents\Dennis\programmering\WestFamilyTree\WestFamilyTree&gt; </w:t>
       </w:r>
-      <w:proofErr w:type="spellStart"/>
       <w:r>
         <w:rPr>
           <w:lang w:val="en-US"/>
         </w:rPr>
-        <w:t>npm</w:t>
-      </w:r>
-      <w:proofErr w:type="spellEnd"/>
-      <w:r>
+        <w:t>python oai_proxy.py</w:t>
+      </w:r>
+    </w:p>
+    <w:p>
+      <w:pPr>
         <w:rPr>
           <w:lang w:val="en-US"/>
         </w:rPr>
-        <w:t xml:space="preserve"> run dev</w:t>
-      </w:r>
-    </w:p>
-    <w:p>
-      <w:pPr>
+      </w:pPr>
+      <w:r>
         <w:rPr>
           <w:lang w:val="en-US"/>
         </w:rPr>
-      </w:pPr>
+        <w:t xml:space="preserve">C:\Users\denni\Documents\Dennis\programmering\WestFamilyTree\WestFamilyTree&gt; </w:t>
+      </w:r>
       <w:r>
         <w:rPr>
           <w:lang w:val="en-US"/>
         </w:rPr>
-        <w:t xml:space="preserve">C:\Users\denni\Documents\Dennis\programmering\WestFamilyTree\WestFamilyTree&gt; </w:t>
-      </w:r>
-      <w:r>
-        <w:rPr>
-          <w:lang w:val="en-US"/>
-        </w:rPr>
-        <w:t>python api_server_cors.py</w:t>
-      </w:r>
-    </w:p>
-    <w:p>
-      <w:pPr>
-        <w:rPr>
-          <w:lang w:val="en-US"/>
-        </w:rPr>
-      </w:pPr>
-      <w:r>
-        <w:rPr>
-          <w:lang w:val="en-US"/>
-        </w:rPr>
-        <w:t xml:space="preserve">C:\Users\denni\Documents\Dennis\programmering\WestFamilyTree\WestFamilyTree&gt; </w:t>
-      </w:r>
-      <w:r>
-        <w:rPr>
-          <w:lang w:val="en-US"/>
-        </w:rPr>
-        <w:t>python oai_proxy.py</w:t>
-      </w:r>
-    </w:p>
-    <w:p>
-      <w:pPr>
-        <w:rPr>
-          <w:lang w:val="en-US"/>
-        </w:rPr>
-      </w:pPr>
-      <w:r>
-        <w:rPr>
-          <w:lang w:val="en-US"/>
-        </w:rPr>
-        <w:t xml:space="preserve">C:\Users\denni\Documents\Dennis\programmering\WestFamilyTree\WestFamilyTree&gt; </w:t>
-      </w:r>
-      <w:proofErr w:type="spellStart"/>
-      <w:r>
-        <w:rPr>
-          <w:lang w:val="en-US"/>
-        </w:rPr>
-        <w:t>npm</w:t>
-      </w:r>
-      <w:proofErr w:type="spellEnd"/>
-      <w:r>
-        <w:rPr>
-          <w:lang w:val="en-US"/>
-        </w:rPr>
-        <w:t xml:space="preserve"> run electron</w:t>
+        <w:t>npm run electron</w:t>
       </w:r>
     </w:p>
     <w:p>
@@ -1618,19 +1560,11 @@
           <w:lang w:val="en-US"/>
         </w:rPr>
       </w:pPr>
-      <w:proofErr w:type="spellStart"/>
       <w:r>
         <w:rPr>
           <w:lang w:val="en-US"/>
         </w:rPr>
-        <w:t>Profilbilds-skördare</w:t>
-      </w:r>
-      <w:proofErr w:type="spellEnd"/>
-      <w:r>
-        <w:rPr>
-          <w:lang w:val="en-US"/>
-        </w:rPr>
-        <w:t xml:space="preserve"> (Crop-to-Profile):</w:t>
+        <w:t>Profilbilds-skördare (Crop-to-Profile):</w:t>
       </w:r>
     </w:p>
     <w:p>
@@ -2636,6 +2570,36 @@
     </w:p>
     <w:p>
       <w:pPr>
+        <w:pStyle w:val="ListParagraph"/>
+        <w:numPr>
+          <w:ilvl w:val="0"/>
+          <w:numId w:val="9"/>
+        </w:numPr>
+      </w:pPr>
+      <w:r>
+        <w:t>Ett anavceratlogg system, info, debug, trace. Ska se alla loggar, En logg ska vara en specifik storlek innan den börjar på nästa. Dem ska sparas som csv och när man öppnar en logg så öppnas ett nytt fönster. Man ska även kunna se tex dem senaste 50, 100, 200 eller 500 raderna från loggen direkt i UI. Man ska även kunna refresha för att updatera realtids loggrutan.</w:t>
+      </w:r>
+    </w:p>
+    <w:p>
+      <w:pPr>
+        <w:pStyle w:val="ListParagraph"/>
+        <w:numPr>
+          <w:ilvl w:val="0"/>
+          <w:numId w:val="9"/>
+        </w:numPr>
+      </w:pPr>
+      <w:r>
+        <w:t>relative paths</w:t>
+      </w:r>
+      <w:r>
+        <w:t xml:space="preserve"> till bilder, källregistret samt platsregistret, db , ja allt!</w:t>
+      </w:r>
+      <w:r>
+        <w:t xml:space="preserve"> Man ska kunna ”mappa” om tex. Bilder så att appen söker igenom en vald mapp och dess undermappar och länkar bilderna rätt efter en flytt.</w:t>
+      </w:r>
+    </w:p>
+    <w:p>
+      <w:pPr>
         <w:pStyle w:val="Heading2"/>
       </w:pPr>
       <w:r>
@@ -2771,6 +2735,21 @@
       </w:pPr>
       <w:r>
         <w:t>Del = I mediafliken på vald bild så ska den raderas, bekräftelse först, sen undotoast.</w:t>
+      </w:r>
+    </w:p>
+    <w:p>
+      <w:pPr>
+        <w:pStyle w:val="ListParagraph"/>
+        <w:numPr>
+          <w:ilvl w:val="0"/>
+          <w:numId w:val="19"/>
+        </w:numPr>
+      </w:pPr>
+      <w:r>
+        <w:t>CTRL+Z</w:t>
+      </w:r>
+      <w:r>
+        <w:t>= Undo</w:t>
       </w:r>
     </w:p>
     <w:p>
@@ -2872,6 +2851,7 @@
         </w:numPr>
       </w:pPr>
       <w:r>
+        <w:lastRenderedPageBreak/>
         <w:t>P= Panoramaläge</w:t>
       </w:r>
     </w:p>
@@ -2949,186 +2929,201 @@
     </w:p>
     <w:p>
       <w:pPr>
+        <w:pStyle w:val="ListParagraph"/>
+        <w:numPr>
+          <w:ilvl w:val="0"/>
+          <w:numId w:val="19"/>
+        </w:numPr>
+      </w:pPr>
+      <w:r>
+        <w:t>CTRL+Z</w:t>
+      </w:r>
+      <w:r>
+        <w:t>= Undo</w:t>
+      </w:r>
+    </w:p>
+    <w:p>
+      <w:pPr>
         <w:pStyle w:val="Heading1"/>
       </w:pPr>
       <w:r>
+        <w:t>PROBLEM</w:t>
+      </w:r>
+    </w:p>
+    <w:p>
+      <w:pPr>
+        <w:pStyle w:val="ListParagraph"/>
+        <w:numPr>
+          <w:ilvl w:val="0"/>
+          <w:numId w:val="1"/>
+        </w:numPr>
+      </w:pPr>
+      <w:r>
+        <w:t>Relationsstigen är mycket svår at få rätt. blir fel varje gång eller så tas den bort!</w:t>
+      </w:r>
+    </w:p>
+    <w:p>
+      <w:pPr>
+        <w:pStyle w:val="ListParagraph"/>
+        <w:numPr>
+          <w:ilvl w:val="0"/>
+          <w:numId w:val="1"/>
+        </w:numPr>
+      </w:pPr>
+      <w:r>
+        <w:t>Om man skapat Svenstorp (M) AI:7 (1869-1878) Bild 3 (AID: v112348.b3, NAD: SE/LLA/13385) så går det inte att skapa i samma bok</w:t>
+      </w:r>
+      <w:r>
+        <w:t xml:space="preserve"> från andra sidor.</w:t>
+      </w:r>
+    </w:p>
+    <w:p>
+      <w:pPr>
+        <w:pStyle w:val="ListParagraph"/>
+        <w:numPr>
+          <w:ilvl w:val="0"/>
+          <w:numId w:val="1"/>
+        </w:numPr>
+      </w:pPr>
+      <w:r>
+        <w:t>M</w:t>
+      </w:r>
+      <w:r>
+        <w:t>e</w:t>
+      </w:r>
+      <w:r>
+        <w:t>rge funkar inte????</w:t>
+      </w:r>
+    </w:p>
+    <w:p>
+      <w:pPr>
+        <w:pStyle w:val="ListParagraph"/>
+        <w:numPr>
+          <w:ilvl w:val="0"/>
+          <w:numId w:val="1"/>
+        </w:numPr>
+      </w:pPr>
+      <w:r>
+        <w:t>Om du är inne i redigera person och trycker på "+koppla källa" så måste man trycka ESC 2grr.</w:t>
+      </w:r>
+    </w:p>
+    <w:p>
+      <w:pPr>
+        <w:pStyle w:val="ListParagraph"/>
+        <w:numPr>
+          <w:ilvl w:val="0"/>
+          <w:numId w:val="1"/>
+        </w:numPr>
+      </w:pPr>
+      <w:r>
+        <w:t>Släktträdets grena</w:t>
+      </w:r>
+      <w:r>
+        <w:t>r</w:t>
+      </w:r>
+      <w:r>
+        <w:t xml:space="preserve"> är OMG!!</w:t>
+      </w:r>
+    </w:p>
+    <w:p>
+      <w:pPr>
+        <w:pStyle w:val="ListParagraph"/>
+        <w:numPr>
+          <w:ilvl w:val="0"/>
+          <w:numId w:val="1"/>
+        </w:numPr>
+      </w:pPr>
+      <w:r>
+        <w:t>Siluetter/bilder överlag kan jag inte få att visa</w:t>
+      </w:r>
+    </w:p>
+    <w:p>
+      <w:pPr>
+        <w:pStyle w:val="ListParagraph"/>
+        <w:numPr>
+          <w:ilvl w:val="0"/>
+          <w:numId w:val="1"/>
+        </w:numPr>
+      </w:pPr>
+      <w:r>
+        <w:t>Facetaggen att följa med när fönstrets storlek ändras! Hållt på 2 dagar!</w:t>
+      </w:r>
+    </w:p>
+    <w:p/>
+    <w:p>
+      <w:pPr>
+        <w:pStyle w:val="Heading1"/>
+      </w:pPr>
+      <w:r>
+        <w:t xml:space="preserve">FEL </w:t>
+      </w:r>
+      <w:r>
+        <w:t xml:space="preserve">Småsaker - </w:t>
+      </w:r>
+      <w:r>
+        <w:t>KÄLLKATALOG</w:t>
+      </w:r>
+    </w:p>
+    <w:p>
+      <w:r>
+        <w:t xml:space="preserve">  -I redigera Arkiv Digital källa: RA-bildid ska heta "SVAR Bild-ID"</w:t>
+      </w:r>
+    </w:p>
+    <w:p>
+      <w:r>
+        <w:t xml:space="preserve">  -I redigera Arkiv Digital källa: NAD ska innehålla en blå knapp till höger precis som AID, i den ska det står NAD.</w:t>
+      </w:r>
+    </w:p>
+    <w:p>
+      <w:r>
+        <w:t xml:space="preserve">  -I redigera Arkiv Digital källa: Om där finns en notering i källan så ska det i källträdet finnas en grön knapp med ett (N). Kanppen ska vara längst till höger.</w:t>
+      </w:r>
+    </w:p>
+    <w:p>
+      <w:r>
+        <w:t xml:space="preserve">  -I redigera Arkiv Digital källa: Knappen i fältet för AID ska heta AID och inte AD.</w:t>
+      </w:r>
+    </w:p>
+    <w:p>
+      <w:r>
+        <w:t xml:space="preserve">  -I redigera Arkiv Digital källa: Lägg till ny koppling ska öppna en minre modal som man kan söka på fritext, med avanserad sök och filter och kryssrutor. Man ska     även se personens närmaste familj såsom, partner,föräldrar,barn,syskon.</w:t>
+      </w:r>
+    </w:p>
+    <w:p>
+      <w:r>
+        <w:t xml:space="preserve">  -I redigera Arkiv Digital källa: När man skapar en tagg så efter man satt ett , så skapas en grön "knapp" med den tagg man skrev som inte går att trycka på. "," ska inte synas i knappen.</w:t>
+      </w:r>
+    </w:p>
+    <w:p>
+      <w:r>
+        <w:t xml:space="preserve">  -I redigera Arkiv Digital källa: Skulle jag vilja koppla Arkiv till platsregistret.</w:t>
+      </w:r>
+    </w:p>
+    <w:p>
+      <w:pPr>
+        <w:pStyle w:val="Heading1"/>
+      </w:pPr>
+      <w:r>
+        <w:t xml:space="preserve">FEL </w:t>
+      </w:r>
+      <w:r>
+        <w:t>Småsaker - PLATSREGISTRET</w:t>
+      </w:r>
+      <w:r>
+        <w:t xml:space="preserve"> </w:t>
+      </w:r>
+    </w:p>
+    <w:p>
+      <w:r>
+        <w:t xml:space="preserve"> -I Platsregistret: Skulle jag vilja ha parsing tex. från wikipedia länk? Helst: https://sok.riksarkivet.se/nad/?postid=Arkis+9396a96e-a0b0-11d3-9e53-009027b0fce9&amp;s=Balder</w:t>
+      </w:r>
+    </w:p>
+    <w:p>
+      <w:pPr>
+        <w:pStyle w:val="Heading1"/>
+      </w:pPr>
+      <w:r>
         <w:lastRenderedPageBreak/>
-        <w:t>PROBLEM</w:t>
-      </w:r>
-    </w:p>
-    <w:p>
-      <w:pPr>
-        <w:pStyle w:val="ListParagraph"/>
-        <w:numPr>
-          <w:ilvl w:val="0"/>
-          <w:numId w:val="1"/>
-        </w:numPr>
-      </w:pPr>
-      <w:r>
-        <w:t>Relationsstigen är mycket svår at få rätt. blir fel varje gång eller så tas den bort!</w:t>
-      </w:r>
-    </w:p>
-    <w:p>
-      <w:pPr>
-        <w:pStyle w:val="ListParagraph"/>
-        <w:numPr>
-          <w:ilvl w:val="0"/>
-          <w:numId w:val="1"/>
-        </w:numPr>
-      </w:pPr>
-      <w:r>
-        <w:t>Om man skapat Svenstorp (M) AI:7 (1869-1878) Bild 3 (AID: v112348.b3, NAD: SE/LLA/13385) så går det inte att skapa i samma bok</w:t>
-      </w:r>
-      <w:r>
-        <w:t xml:space="preserve"> från andra sidor.</w:t>
-      </w:r>
-    </w:p>
-    <w:p>
-      <w:pPr>
-        <w:pStyle w:val="ListParagraph"/>
-        <w:numPr>
-          <w:ilvl w:val="0"/>
-          <w:numId w:val="1"/>
-        </w:numPr>
-      </w:pPr>
-      <w:r>
-        <w:t>M</w:t>
-      </w:r>
-      <w:r>
-        <w:t>e</w:t>
-      </w:r>
-      <w:r>
-        <w:t>rge funkar inte????</w:t>
-      </w:r>
-    </w:p>
-    <w:p>
-      <w:pPr>
-        <w:pStyle w:val="ListParagraph"/>
-        <w:numPr>
-          <w:ilvl w:val="0"/>
-          <w:numId w:val="1"/>
-        </w:numPr>
-      </w:pPr>
-      <w:r>
-        <w:t>Om du är inne i redigera person och trycker på "+koppla källa" så måste man trycka ESC 2grr.</w:t>
-      </w:r>
-    </w:p>
-    <w:p>
-      <w:pPr>
-        <w:pStyle w:val="ListParagraph"/>
-        <w:numPr>
-          <w:ilvl w:val="0"/>
-          <w:numId w:val="1"/>
-        </w:numPr>
-      </w:pPr>
-      <w:r>
-        <w:t>Släktträdets grena</w:t>
-      </w:r>
-      <w:r>
-        <w:t>r</w:t>
-      </w:r>
-      <w:r>
-        <w:t xml:space="preserve"> är OMG!!</w:t>
-      </w:r>
-    </w:p>
-    <w:p>
-      <w:pPr>
-        <w:pStyle w:val="ListParagraph"/>
-        <w:numPr>
-          <w:ilvl w:val="0"/>
-          <w:numId w:val="1"/>
-        </w:numPr>
-      </w:pPr>
-      <w:r>
-        <w:t>Siluetter/bilder överlag kan jag inte få att visa</w:t>
-      </w:r>
-    </w:p>
-    <w:p>
-      <w:pPr>
-        <w:pStyle w:val="ListParagraph"/>
-        <w:numPr>
-          <w:ilvl w:val="0"/>
-          <w:numId w:val="1"/>
-        </w:numPr>
-      </w:pPr>
-      <w:r>
-        <w:t>Facetaggen att följa med när fönstrets storlek ändras! Hållt på 2 dagar!</w:t>
-      </w:r>
-    </w:p>
-    <w:p/>
-    <w:p>
-      <w:pPr>
-        <w:pStyle w:val="Heading1"/>
-      </w:pPr>
-      <w:r>
-        <w:t xml:space="preserve">FEL </w:t>
-      </w:r>
-      <w:r>
-        <w:t xml:space="preserve">Småsaker - </w:t>
-      </w:r>
-      <w:r>
-        <w:t>KÄLLKATALOG</w:t>
-      </w:r>
-    </w:p>
-    <w:p>
-      <w:r>
-        <w:t xml:space="preserve">  -I redigera Arkiv Digital källa: RA-bildid ska heta "SVAR Bild-ID"</w:t>
-      </w:r>
-    </w:p>
-    <w:p>
-      <w:r>
-        <w:t xml:space="preserve">  -I redigera Arkiv Digital källa: NAD ska innehålla en blå knapp till höger precis som AID, i den ska det står NAD.</w:t>
-      </w:r>
-    </w:p>
-    <w:p>
-      <w:r>
-        <w:t xml:space="preserve">  -I redigera Arkiv Digital källa: Om där finns en notering i källan så ska det i källträdet finnas en grön knapp med ett (N). Kanppen ska vara längst till höger.</w:t>
-      </w:r>
-    </w:p>
-    <w:p>
-      <w:r>
-        <w:t xml:space="preserve">  -I redigera Arkiv Digital källa: Knappen i fältet för AID ska heta AID och inte AD.</w:t>
-      </w:r>
-    </w:p>
-    <w:p>
-      <w:r>
-        <w:t xml:space="preserve">  -I redigera Arkiv Digital källa: Lägg till ny koppling ska öppna en minre modal som man kan söka på fritext, med avanserad sök och filter och kryssrutor. Man ska     även se personens närmaste familj såsom, partner,föräldrar,barn,syskon.</w:t>
-      </w:r>
-    </w:p>
-    <w:p>
-      <w:r>
-        <w:t xml:space="preserve">  -I redigera Arkiv Digital källa: När man skapar en tagg så efter man satt ett , så skapas en grön "knapp" med den tagg man skrev som inte går att trycka på. "," ska inte synas i knappen.</w:t>
-      </w:r>
-    </w:p>
-    <w:p>
-      <w:r>
-        <w:t xml:space="preserve">  -I redigera Arkiv Digital källa: Skulle jag vilja koppla Arkiv till platsregistret.</w:t>
-      </w:r>
-    </w:p>
-    <w:p>
-      <w:pPr>
-        <w:pStyle w:val="Heading1"/>
-      </w:pPr>
-      <w:r>
-        <w:t xml:space="preserve">FEL </w:t>
-      </w:r>
-      <w:r>
-        <w:t>Småsaker - PLATSREGISTRET</w:t>
-      </w:r>
-      <w:r>
-        <w:t xml:space="preserve"> </w:t>
-      </w:r>
-    </w:p>
-    <w:p>
-      <w:r>
-        <w:t xml:space="preserve"> -I Platsregistret: Skulle jag vilja ha parsing tex. från wikipedia länk? Helst: https://sok.riksarkivet.se/nad/?postid=Arkis+9396a96e-a0b0-11d3-9e53-009027b0fce9&amp;s=Balder</w:t>
-      </w:r>
-    </w:p>
-    <w:p>
-      <w:pPr>
-        <w:pStyle w:val="Heading1"/>
-      </w:pPr>
-      <w:r>
         <w:t>PLATSER</w:t>
       </w:r>
     </w:p>
@@ -3193,11 +3188,7 @@
     </w:p>
     <w:p>
       <w:r>
-        <w:t xml:space="preserve">Om man importerar en GEDCOM så ska dem synkas med den officiella ELLER användarens egna platser. Dem som inte matchar ska hamna i en flik som heter ”Rätta” med passande ikon, på den fliken ska där stå antal som behöver redigeras. I fliken ska man kunna söka i fritex samt att där finns en knapp som heter koppla där man kan skriva i plats id elelr söka fritext och dela upp strängen efter </w:t>
-      </w:r>
-      <w:r>
-        <w:lastRenderedPageBreak/>
-        <w:t>lään, kommun, församling, ort osv.</w:t>
+        <w:t>Om man importerar en GEDCOM så ska dem synkas med den officiella ELLER användarens egna platser. Dem som inte matchar ska hamna i en flik som heter ”Rätta” med passande ikon, på den fliken ska där stå antal som behöver redigeras. I fliken ska man kunna söka i fritex samt att där finns en knapp som heter koppla där man kan skriva i plats id elelr söka fritext och dela upp strängen efter lään, kommun, församling, ort osv.</w:t>
       </w:r>
       <w:r>
         <w:br/>
@@ -3334,14 +3325,13 @@
           <w:lang w:val="en-US"/>
         </w:rPr>
       </w:pPr>
-      <w:proofErr w:type="spellStart"/>
       <w:r>
         <w:rPr>
           <w:lang w:val="en-US"/>
         </w:rPr>
+        <w:lastRenderedPageBreak/>
         <w:t>Formatet</w:t>
       </w:r>
-      <w:proofErr w:type="spellEnd"/>
     </w:p>
     <w:p>
       <w:pPr>
@@ -3349,19 +3339,11 @@
           <w:lang w:val="en-US"/>
         </w:rPr>
       </w:pPr>
-      <w:proofErr w:type="spellStart"/>
       <w:r>
         <w:rPr>
           <w:lang w:val="en-US"/>
         </w:rPr>
-        <w:t>Stad</w:t>
-      </w:r>
-      <w:proofErr w:type="spellEnd"/>
-      <w:r>
-        <w:rPr>
-          <w:lang w:val="en-US"/>
-        </w:rPr>
-        <w:t xml:space="preserve"> (City/Township), County, Stat, Land</w:t>
+        <w:t>Stad (City/Township), County, Stat, Land</w:t>
       </w:r>
     </w:p>
     <w:p>
@@ -3398,7 +3380,6 @@
     </w:p>
     <w:p>
       <w:r>
-        <w:lastRenderedPageBreak/>
         <w:t>Exempel i GEDCOM</w:t>
       </w:r>
     </w:p>
@@ -3437,20 +3418,7 @@
           <w:lang w:val="en-US"/>
         </w:rPr>
         <w:tab/>
-      </w:r>
-      <w:proofErr w:type="spellStart"/>
-      <w:r>
-        <w:rPr>
-          <w:lang w:val="en-US"/>
-        </w:rPr>
-        <w:t>Landsbygd</w:t>
-      </w:r>
-      <w:proofErr w:type="spellEnd"/>
-      <w:r>
-        <w:rPr>
-          <w:lang w:val="en-US"/>
-        </w:rPr>
-        <w:t>: Chisago Lake Twp, Chisago, MN, USA</w:t>
+        <w:t>Landsbygd: Chisago Lake Twp, Chisago, MN, USA</w:t>
       </w:r>
     </w:p>
     <w:p>
@@ -3499,49 +3467,7 @@
           <w:lang w:val="en-US"/>
         </w:rPr>
         <w:tab/>
-        <w:t xml:space="preserve">const parts = </w:t>
-      </w:r>
-      <w:proofErr w:type="spellStart"/>
-      <w:r>
-        <w:rPr>
-          <w:lang w:val="en-US"/>
-        </w:rPr>
-        <w:t>placString.split</w:t>
-      </w:r>
-      <w:proofErr w:type="spellEnd"/>
-      <w:r>
-        <w:rPr>
-          <w:lang w:val="en-US"/>
-        </w:rPr>
-        <w:t>(','</w:t>
-      </w:r>
-      <w:proofErr w:type="gramStart"/>
-      <w:r>
-        <w:rPr>
-          <w:lang w:val="en-US"/>
-        </w:rPr>
-        <w:t>).map</w:t>
-      </w:r>
-      <w:proofErr w:type="gramEnd"/>
-      <w:r>
-        <w:rPr>
-          <w:lang w:val="en-US"/>
-        </w:rPr>
-        <w:t xml:space="preserve">(p =&gt; </w:t>
-      </w:r>
-      <w:proofErr w:type="spellStart"/>
-      <w:r>
-        <w:rPr>
-          <w:lang w:val="en-US"/>
-        </w:rPr>
-        <w:t>p.trim</w:t>
-      </w:r>
-      <w:proofErr w:type="spellEnd"/>
-      <w:r>
-        <w:rPr>
-          <w:lang w:val="en-US"/>
-        </w:rPr>
-        <w:t>());</w:t>
+        <w:t>const parts = placString.split(',').map(p =&gt; p.trim());</w:t>
       </w:r>
     </w:p>
     <w:p>
@@ -3641,6 +3567,7 @@
     </w:p>
     <w:p>
       <w:r>
+        <w:lastRenderedPageBreak/>
         <w:t>•</w:t>
       </w:r>
       <w:r>
@@ -3712,7 +3639,6 @@
     </w:p>
     <w:p>
       <w:r>
-        <w:lastRenderedPageBreak/>
         <w:t>Nivå 3</w:t>
       </w:r>
       <w:r>

</xml_diff>